<commit_message>
docs: update testing report
</commit_message>
<xml_diff>
--- a/docs/test/product_module_test_report.docx
+++ b/docs/test/product_module_test_report.docx
@@ -1,6 +1,6 @@
 
 <file path=word/document.xml><?xml version="1.0" encoding="utf-8"?>
-<w:document xmlns:wpc="http://schemas.microsoft.com/office/word/2010/wordprocessingCanvas" xmlns:mc="http://schemas.openxmlformats.org/markup-compatibility/2006" xmlns:o="urn:schemas-microsoft-com:office:office" xmlns:r="http://schemas.openxmlformats.org/officeDocument/2006/relationships" xmlns:m="http://schemas.openxmlformats.org/officeDocument/2006/math" xmlns:v="urn:schemas-microsoft-com:vml" xmlns:wp14="http://schemas.microsoft.com/office/word/2010/wordprocessingDrawing" xmlns:wp="http://schemas.openxmlformats.org/drawingml/2006/wordprocessingDrawing" xmlns:w10="urn:schemas-microsoft-com:office:word" xmlns:w="http://schemas.openxmlformats.org/wordprocessingml/2006/main" xmlns:w14="http://schemas.microsoft.com/office/word/2010/wordml" xmlns:w15="http://schemas.microsoft.com/office/word/2012/wordml" xmlns:wpg="http://schemas.microsoft.com/office/word/2010/wordprocessingGroup" xmlns:wpi="http://schemas.microsoft.com/office/word/2010/wordprocessingInk" xmlns:wne="http://schemas.microsoft.com/office/word/2006/wordml" xmlns:wps="http://schemas.microsoft.com/office/word/2010/wordprocessingShape" mc:Ignorable="w14 w15 wp14">
+<w:document xmlns:wpc="http://schemas.microsoft.com/office/word/2010/wordprocessingCanvas" xmlns:cx="http://schemas.microsoft.com/office/drawing/2014/chartex" xmlns:cx1="http://schemas.microsoft.com/office/drawing/2015/9/8/chartex" xmlns:cx2="http://schemas.microsoft.com/office/drawing/2015/10/21/chartex" xmlns:cx3="http://schemas.microsoft.com/office/drawing/2016/5/9/chartex" xmlns:cx4="http://schemas.microsoft.com/office/drawing/2016/5/10/chartex" xmlns:cx5="http://schemas.microsoft.com/office/drawing/2016/5/11/chartex" xmlns:cx6="http://schemas.microsoft.com/office/drawing/2016/5/12/chartex" xmlns:cx7="http://schemas.microsoft.com/office/drawing/2016/5/13/chartex" xmlns:cx8="http://schemas.microsoft.com/office/drawing/2016/5/14/chartex" xmlns:mc="http://schemas.openxmlformats.org/markup-compatibility/2006" xmlns:aink="http://schemas.microsoft.com/office/drawing/2016/ink" xmlns:am3d="http://schemas.microsoft.com/office/drawing/2017/model3d" xmlns:o="urn:schemas-microsoft-com:office:office" xmlns:oel="http://schemas.microsoft.com/office/2019/extlst" xmlns:r="http://schemas.openxmlformats.org/officeDocument/2006/relationships" xmlns:m="http://schemas.openxmlformats.org/officeDocument/2006/math" xmlns:v="urn:schemas-microsoft-com:vml" xmlns:wp14="http://schemas.microsoft.com/office/word/2010/wordprocessingDrawing" xmlns:wp="http://schemas.openxmlformats.org/drawingml/2006/wordprocessingDrawing" xmlns:w10="urn:schemas-microsoft-com:office:word" xmlns:w="http://schemas.openxmlformats.org/wordprocessingml/2006/main" xmlns:w14="http://schemas.microsoft.com/office/word/2010/wordml" xmlns:w15="http://schemas.microsoft.com/office/word/2012/wordml" xmlns:w16cex="http://schemas.microsoft.com/office/word/2018/wordml/cex" xmlns:w16cid="http://schemas.microsoft.com/office/word/2016/wordml/cid" xmlns:w16="http://schemas.microsoft.com/office/word/2018/wordml" xmlns:w16du="http://schemas.microsoft.com/office/word/2023/wordml/word16du" xmlns:w16sdtdh="http://schemas.microsoft.com/office/word/2020/wordml/sdtdatahash" xmlns:w16sdtfl="http://schemas.microsoft.com/office/word/2024/wordml/sdtformatlock" xmlns:w16se="http://schemas.microsoft.com/office/word/2015/wordml/symex" xmlns:wpg="http://schemas.microsoft.com/office/word/2010/wordprocessingGroup" xmlns:wpi="http://schemas.microsoft.com/office/word/2010/wordprocessingInk" xmlns:wne="http://schemas.microsoft.com/office/word/2006/wordml" xmlns:wps="http://schemas.microsoft.com/office/word/2010/wordprocessingShape" mc:Ignorable="w14 w15 w16se w16cid w16 w16cex w16sdtdh w16sdtfl w16du wp14">
   <w:body>
     <w:p>
       <w:pPr>
@@ -11,9 +11,9 @@
           <w:b/>
           <w:bCs/>
           <w:kern w:val="36"/>
-          <w:sz w:val="48"/>
-          <w:szCs w:val="48"/>
-          <w:lang w:eastAsia="ru-RU"/>
+          <w:sz w:val="28"/>
+          <w:szCs w:val="28"/>
+          <w:lang w:val="uk-UA" w:eastAsia="ru-RU"/>
         </w:rPr>
       </w:pPr>
       <w:r>
@@ -22,9 +22,9 @@
           <w:b/>
           <w:bCs/>
           <w:kern w:val="36"/>
-          <w:sz w:val="48"/>
-          <w:szCs w:val="48"/>
-          <w:lang w:eastAsia="ru-RU"/>
+          <w:sz w:val="28"/>
+          <w:szCs w:val="28"/>
+          <w:lang w:val="uk-UA" w:eastAsia="ru-RU"/>
         </w:rPr>
         <w:t>Звіт про результати тестування програмного забезпечення</w:t>
       </w:r>
@@ -34,33 +34,35 @@
           <w:b/>
           <w:bCs/>
           <w:kern w:val="36"/>
-          <w:sz w:val="48"/>
-          <w:szCs w:val="48"/>
-          <w:lang w:eastAsia="ru-RU"/>
+          <w:sz w:val="28"/>
+          <w:szCs w:val="28"/>
+          <w:lang w:val="uk-UA" w:eastAsia="ru-RU"/>
         </w:rPr>
         <w:t xml:space="preserve"> (</w:t>
       </w:r>
+      <w:proofErr w:type="spellStart"/>
       <w:r>
         <w:rPr>
           <w:rFonts w:ascii="Times New Roman" w:eastAsia="Times New Roman" w:hAnsi="Times New Roman" w:cs="Times New Roman"/>
           <w:b/>
           <w:bCs/>
           <w:kern w:val="36"/>
-          <w:sz w:val="48"/>
-          <w:szCs w:val="48"/>
-          <w:lang w:val="en-US" w:eastAsia="ru-RU"/>
+          <w:sz w:val="28"/>
+          <w:szCs w:val="28"/>
+          <w:lang w:val="uk-UA" w:eastAsia="ru-RU"/>
         </w:rPr>
         <w:t>Product</w:t>
       </w:r>
+      <w:proofErr w:type="spellEnd"/>
       <w:r>
         <w:rPr>
           <w:rFonts w:ascii="Times New Roman" w:eastAsia="Times New Roman" w:hAnsi="Times New Roman" w:cs="Times New Roman"/>
           <w:b/>
           <w:bCs/>
           <w:kern w:val="36"/>
-          <w:sz w:val="48"/>
-          <w:szCs w:val="48"/>
-          <w:lang w:eastAsia="ru-RU"/>
+          <w:sz w:val="28"/>
+          <w:szCs w:val="28"/>
+          <w:lang w:val="uk-UA" w:eastAsia="ru-RU"/>
         </w:rPr>
         <w:t>)</w:t>
       </w:r>
@@ -73,9 +75,9 @@
           <w:rFonts w:ascii="Times New Roman" w:eastAsia="Times New Roman" w:hAnsi="Times New Roman" w:cs="Times New Roman"/>
           <w:b/>
           <w:bCs/>
-          <w:sz w:val="36"/>
-          <w:szCs w:val="36"/>
-          <w:lang w:eastAsia="ru-RU"/>
+          <w:sz w:val="28"/>
+          <w:szCs w:val="28"/>
+          <w:lang w:val="uk-UA" w:eastAsia="ru-RU"/>
         </w:rPr>
       </w:pPr>
       <w:r>
@@ -83,11 +85,35 @@
           <w:rFonts w:ascii="Times New Roman" w:eastAsia="Times New Roman" w:hAnsi="Times New Roman" w:cs="Times New Roman"/>
           <w:b/>
           <w:bCs/>
-          <w:sz w:val="36"/>
-          <w:szCs w:val="36"/>
-          <w:lang w:eastAsia="ru-RU"/>
-        </w:rPr>
-        <w:t>1. Unit-тестування</w:t>
+          <w:sz w:val="28"/>
+          <w:szCs w:val="28"/>
+          <w:lang w:val="uk-UA" w:eastAsia="ru-RU"/>
+        </w:rPr>
+        <w:t xml:space="preserve">1. </w:t>
+      </w:r>
+      <w:proofErr w:type="spellStart"/>
+      <w:r>
+        <w:rPr>
+          <w:rFonts w:ascii="Times New Roman" w:eastAsia="Times New Roman" w:hAnsi="Times New Roman" w:cs="Times New Roman"/>
+          <w:b/>
+          <w:bCs/>
+          <w:sz w:val="28"/>
+          <w:szCs w:val="28"/>
+          <w:lang w:val="uk-UA" w:eastAsia="ru-RU"/>
+        </w:rPr>
+        <w:t>Unit</w:t>
+      </w:r>
+      <w:proofErr w:type="spellEnd"/>
+      <w:r>
+        <w:rPr>
+          <w:rFonts w:ascii="Times New Roman" w:eastAsia="Times New Roman" w:hAnsi="Times New Roman" w:cs="Times New Roman"/>
+          <w:b/>
+          <w:bCs/>
+          <w:sz w:val="28"/>
+          <w:szCs w:val="28"/>
+          <w:lang w:val="uk-UA" w:eastAsia="ru-RU"/>
+        </w:rPr>
+        <w:t>-тестування</w:t>
       </w:r>
     </w:p>
     <w:p>
@@ -97,19 +123,39 @@
         <w:jc w:val="both"/>
         <w:rPr>
           <w:rFonts w:ascii="Times New Roman" w:eastAsia="Times New Roman" w:hAnsi="Times New Roman" w:cs="Times New Roman"/>
-          <w:sz w:val="24"/>
-          <w:szCs w:val="24"/>
-          <w:lang w:eastAsia="ru-RU"/>
-        </w:rPr>
-      </w:pPr>
-      <w:r>
-        <w:rPr>
-          <w:rFonts w:ascii="Times New Roman" w:eastAsia="Times New Roman" w:hAnsi="Times New Roman" w:cs="Times New Roman"/>
-          <w:sz w:val="24"/>
-          <w:szCs w:val="24"/>
-          <w:lang w:eastAsia="ru-RU"/>
-        </w:rPr>
-        <w:t>Було обрано модуль роботи з товарами (Product) як приклад для повного покриття модульними тестами. Розроблено набір тестів, які ізольовано перевіряють роботу сервісів і контролерів, включаючи:</w:t>
+          <w:sz w:val="28"/>
+          <w:szCs w:val="28"/>
+          <w:lang w:val="uk-UA" w:eastAsia="ru-RU"/>
+        </w:rPr>
+      </w:pPr>
+      <w:r>
+        <w:rPr>
+          <w:rFonts w:ascii="Times New Roman" w:eastAsia="Times New Roman" w:hAnsi="Times New Roman" w:cs="Times New Roman"/>
+          <w:sz w:val="28"/>
+          <w:szCs w:val="28"/>
+          <w:lang w:val="uk-UA" w:eastAsia="ru-RU"/>
+        </w:rPr>
+        <w:t>Було обрано модуль роботи з товарами (</w:t>
+      </w:r>
+      <w:proofErr w:type="spellStart"/>
+      <w:r>
+        <w:rPr>
+          <w:rFonts w:ascii="Times New Roman" w:eastAsia="Times New Roman" w:hAnsi="Times New Roman" w:cs="Times New Roman"/>
+          <w:sz w:val="28"/>
+          <w:szCs w:val="28"/>
+          <w:lang w:val="uk-UA" w:eastAsia="ru-RU"/>
+        </w:rPr>
+        <w:t>Product</w:t>
+      </w:r>
+      <w:proofErr w:type="spellEnd"/>
+      <w:r>
+        <w:rPr>
+          <w:rFonts w:ascii="Times New Roman" w:eastAsia="Times New Roman" w:hAnsi="Times New Roman" w:cs="Times New Roman"/>
+          <w:sz w:val="28"/>
+          <w:szCs w:val="28"/>
+          <w:lang w:val="uk-UA" w:eastAsia="ru-RU"/>
+        </w:rPr>
+        <w:t>) як приклад для повного покриття модульними тестами. Розроблено набір тестів, які ізольовано перевіряють роботу сервісів і контролерів, включаючи:</w:t>
       </w:r>
     </w:p>
     <w:p>
@@ -118,23 +164,47 @@
           <w:ilvl w:val="0"/>
           <w:numId w:val="11"/>
         </w:numPr>
+        <w:tabs>
+          <w:tab w:val="clear" w:pos="720"/>
+        </w:tabs>
         <w:spacing w:before="100" w:beforeAutospacing="1" w:after="100" w:afterAutospacing="1" w:line="360" w:lineRule="auto"/>
+        <w:ind w:left="0" w:firstLine="709"/>
         <w:jc w:val="both"/>
         <w:rPr>
           <w:rFonts w:ascii="Times New Roman" w:eastAsia="Times New Roman" w:hAnsi="Times New Roman" w:cs="Times New Roman"/>
-          <w:sz w:val="24"/>
-          <w:szCs w:val="24"/>
-          <w:lang w:eastAsia="ru-RU"/>
-        </w:rPr>
-      </w:pPr>
-      <w:r>
-        <w:rPr>
-          <w:rFonts w:ascii="Times New Roman" w:eastAsia="Times New Roman" w:hAnsi="Times New Roman" w:cs="Times New Roman"/>
-          <w:sz w:val="24"/>
-          <w:szCs w:val="24"/>
-          <w:lang w:eastAsia="ru-RU"/>
-        </w:rPr>
-        <w:t>створення товару з валідними даними;</w:t>
+          <w:sz w:val="28"/>
+          <w:szCs w:val="28"/>
+          <w:lang w:val="uk-UA" w:eastAsia="ru-RU"/>
+        </w:rPr>
+      </w:pPr>
+      <w:r>
+        <w:rPr>
+          <w:rFonts w:ascii="Times New Roman" w:eastAsia="Times New Roman" w:hAnsi="Times New Roman" w:cs="Times New Roman"/>
+          <w:sz w:val="28"/>
+          <w:szCs w:val="28"/>
+          <w:lang w:val="uk-UA" w:eastAsia="ru-RU"/>
+        </w:rPr>
+        <w:t xml:space="preserve">створення товару з </w:t>
+      </w:r>
+      <w:proofErr w:type="spellStart"/>
+      <w:r>
+        <w:rPr>
+          <w:rFonts w:ascii="Times New Roman" w:eastAsia="Times New Roman" w:hAnsi="Times New Roman" w:cs="Times New Roman"/>
+          <w:sz w:val="28"/>
+          <w:szCs w:val="28"/>
+          <w:lang w:val="uk-UA" w:eastAsia="ru-RU"/>
+        </w:rPr>
+        <w:t>валідними</w:t>
+      </w:r>
+      <w:proofErr w:type="spellEnd"/>
+      <w:r>
+        <w:rPr>
+          <w:rFonts w:ascii="Times New Roman" w:eastAsia="Times New Roman" w:hAnsi="Times New Roman" w:cs="Times New Roman"/>
+          <w:sz w:val="28"/>
+          <w:szCs w:val="28"/>
+          <w:lang w:val="uk-UA" w:eastAsia="ru-RU"/>
+        </w:rPr>
+        <w:t xml:space="preserve"> даними;</w:t>
       </w:r>
     </w:p>
     <w:p>
@@ -143,21 +213,25 @@
           <w:ilvl w:val="0"/>
           <w:numId w:val="11"/>
         </w:numPr>
+        <w:tabs>
+          <w:tab w:val="clear" w:pos="720"/>
+        </w:tabs>
         <w:spacing w:before="100" w:beforeAutospacing="1" w:after="100" w:afterAutospacing="1" w:line="360" w:lineRule="auto"/>
+        <w:ind w:left="0" w:firstLine="709"/>
         <w:jc w:val="both"/>
         <w:rPr>
           <w:rFonts w:ascii="Times New Roman" w:eastAsia="Times New Roman" w:hAnsi="Times New Roman" w:cs="Times New Roman"/>
-          <w:sz w:val="24"/>
-          <w:szCs w:val="24"/>
-          <w:lang w:eastAsia="ru-RU"/>
-        </w:rPr>
-      </w:pPr>
-      <w:r>
-        <w:rPr>
-          <w:rFonts w:ascii="Times New Roman" w:eastAsia="Times New Roman" w:hAnsi="Times New Roman" w:cs="Times New Roman"/>
-          <w:sz w:val="24"/>
-          <w:szCs w:val="24"/>
-          <w:lang w:eastAsia="ru-RU"/>
+          <w:sz w:val="28"/>
+          <w:szCs w:val="28"/>
+          <w:lang w:val="uk-UA" w:eastAsia="ru-RU"/>
+        </w:rPr>
+      </w:pPr>
+      <w:r>
+        <w:rPr>
+          <w:rFonts w:ascii="Times New Roman" w:eastAsia="Times New Roman" w:hAnsi="Times New Roman" w:cs="Times New Roman"/>
+          <w:sz w:val="28"/>
+          <w:szCs w:val="28"/>
+          <w:lang w:val="uk-UA" w:eastAsia="ru-RU"/>
         </w:rPr>
         <w:t>обробку помилкових і неповних вхідних даних;</w:t>
       </w:r>
@@ -168,21 +242,25 @@
           <w:ilvl w:val="0"/>
           <w:numId w:val="11"/>
         </w:numPr>
+        <w:tabs>
+          <w:tab w:val="clear" w:pos="720"/>
+        </w:tabs>
         <w:spacing w:before="100" w:beforeAutospacing="1" w:after="100" w:afterAutospacing="1" w:line="360" w:lineRule="auto"/>
+        <w:ind w:left="0" w:firstLine="709"/>
         <w:jc w:val="both"/>
         <w:rPr>
           <w:rFonts w:ascii="Times New Roman" w:eastAsia="Times New Roman" w:hAnsi="Times New Roman" w:cs="Times New Roman"/>
-          <w:sz w:val="24"/>
-          <w:szCs w:val="24"/>
-          <w:lang w:eastAsia="ru-RU"/>
-        </w:rPr>
-      </w:pPr>
-      <w:r>
-        <w:rPr>
-          <w:rFonts w:ascii="Times New Roman" w:eastAsia="Times New Roman" w:hAnsi="Times New Roman" w:cs="Times New Roman"/>
-          <w:sz w:val="24"/>
-          <w:szCs w:val="24"/>
-          <w:lang w:eastAsia="ru-RU"/>
+          <w:sz w:val="28"/>
+          <w:szCs w:val="28"/>
+          <w:lang w:val="uk-UA" w:eastAsia="ru-RU"/>
+        </w:rPr>
+      </w:pPr>
+      <w:r>
+        <w:rPr>
+          <w:rFonts w:ascii="Times New Roman" w:eastAsia="Times New Roman" w:hAnsi="Times New Roman" w:cs="Times New Roman"/>
+          <w:sz w:val="28"/>
+          <w:szCs w:val="28"/>
+          <w:lang w:val="uk-UA" w:eastAsia="ru-RU"/>
         </w:rPr>
         <w:t>поведінку сервісу за умов виникнення винятків;</w:t>
       </w:r>
@@ -193,21 +271,25 @@
           <w:ilvl w:val="0"/>
           <w:numId w:val="11"/>
         </w:numPr>
+        <w:tabs>
+          <w:tab w:val="clear" w:pos="720"/>
+        </w:tabs>
         <w:spacing w:before="100" w:beforeAutospacing="1" w:after="100" w:afterAutospacing="1" w:line="360" w:lineRule="auto"/>
+        <w:ind w:left="0" w:firstLine="709"/>
         <w:jc w:val="both"/>
         <w:rPr>
           <w:rFonts w:ascii="Times New Roman" w:eastAsia="Times New Roman" w:hAnsi="Times New Roman" w:cs="Times New Roman"/>
-          <w:sz w:val="24"/>
-          <w:szCs w:val="24"/>
-          <w:lang w:eastAsia="ru-RU"/>
-        </w:rPr>
-      </w:pPr>
-      <w:r>
-        <w:rPr>
-          <w:rFonts w:ascii="Times New Roman" w:eastAsia="Times New Roman" w:hAnsi="Times New Roman" w:cs="Times New Roman"/>
-          <w:sz w:val="24"/>
-          <w:szCs w:val="24"/>
-          <w:lang w:eastAsia="ru-RU"/>
+          <w:sz w:val="28"/>
+          <w:szCs w:val="28"/>
+          <w:lang w:val="uk-UA" w:eastAsia="ru-RU"/>
+        </w:rPr>
+      </w:pPr>
+      <w:r>
+        <w:rPr>
+          <w:rFonts w:ascii="Times New Roman" w:eastAsia="Times New Roman" w:hAnsi="Times New Roman" w:cs="Times New Roman"/>
+          <w:sz w:val="28"/>
+          <w:szCs w:val="28"/>
+          <w:lang w:val="uk-UA" w:eastAsia="ru-RU"/>
         </w:rPr>
         <w:t>коректність бізнес-логіки без участі зовнішніх ресурсів.</w:t>
       </w:r>
@@ -219,32 +301,95 @@
         <w:jc w:val="both"/>
         <w:rPr>
           <w:rFonts w:ascii="Times New Roman" w:eastAsia="Times New Roman" w:hAnsi="Times New Roman" w:cs="Times New Roman"/>
-          <w:sz w:val="24"/>
-          <w:szCs w:val="24"/>
-          <w:lang w:eastAsia="ru-RU"/>
-        </w:rPr>
-      </w:pPr>
-      <w:r>
-        <w:rPr>
-          <w:rFonts w:ascii="Times New Roman" w:eastAsia="Times New Roman" w:hAnsi="Times New Roman" w:cs="Times New Roman"/>
-          <w:sz w:val="24"/>
-          <w:szCs w:val="24"/>
-          <w:lang w:eastAsia="ru-RU"/>
-        </w:rPr>
-        <w:t>У тестах було змодельовано залежності сервісів, що дозволило сфокусувати перевірку саме на внутрішній логіці модуля. Покриття включає всі основні гілки виконання та сценарії обробки помилок.</w:t>
+          <w:sz w:val="28"/>
+          <w:szCs w:val="28"/>
+          <w:lang w:val="uk-UA" w:eastAsia="ru-RU"/>
+        </w:rPr>
+      </w:pPr>
+      <w:r>
+        <w:rPr>
+          <w:rFonts w:ascii="Times New Roman" w:eastAsia="Times New Roman" w:hAnsi="Times New Roman" w:cs="Times New Roman"/>
+          <w:sz w:val="28"/>
+          <w:szCs w:val="28"/>
+          <w:lang w:val="uk-UA" w:eastAsia="ru-RU"/>
+        </w:rPr>
+        <w:t xml:space="preserve">У тестах було </w:t>
+      </w:r>
+      <w:proofErr w:type="spellStart"/>
+      <w:r>
+        <w:rPr>
+          <w:rFonts w:ascii="Times New Roman" w:eastAsia="Times New Roman" w:hAnsi="Times New Roman" w:cs="Times New Roman"/>
+          <w:sz w:val="28"/>
+          <w:szCs w:val="28"/>
+          <w:lang w:val="uk-UA" w:eastAsia="ru-RU"/>
+        </w:rPr>
+        <w:t>змодельовано</w:t>
+      </w:r>
+      <w:proofErr w:type="spellEnd"/>
+      <w:r>
+        <w:rPr>
+          <w:rFonts w:ascii="Times New Roman" w:eastAsia="Times New Roman" w:hAnsi="Times New Roman" w:cs="Times New Roman"/>
+          <w:sz w:val="28"/>
+          <w:szCs w:val="28"/>
+          <w:lang w:val="uk-UA" w:eastAsia="ru-RU"/>
+        </w:rPr>
+        <w:t xml:space="preserve"> залежності сервісів, що дозволило сфокусувати перевірку саме на внутрішній </w:t>
+      </w:r>
+      <w:proofErr w:type="spellStart"/>
+      <w:r>
+        <w:rPr>
+          <w:rFonts w:ascii="Times New Roman" w:eastAsia="Times New Roman" w:hAnsi="Times New Roman" w:cs="Times New Roman"/>
+          <w:sz w:val="28"/>
+          <w:szCs w:val="28"/>
+          <w:lang w:val="uk-UA" w:eastAsia="ru-RU"/>
+        </w:rPr>
+        <w:t>логіці</w:t>
+      </w:r>
+      <w:proofErr w:type="spellEnd"/>
+      <w:r>
+        <w:rPr>
+          <w:rFonts w:ascii="Times New Roman" w:eastAsia="Times New Roman" w:hAnsi="Times New Roman" w:cs="Times New Roman"/>
+          <w:sz w:val="28"/>
+          <w:szCs w:val="28"/>
+          <w:lang w:val="uk-UA" w:eastAsia="ru-RU"/>
+        </w:rPr>
+        <w:t xml:space="preserve"> модуля. Покриття включає всі основні гілки виконання та сценарії обробки помилок.</w:t>
       </w:r>
     </w:p>
     <w:p>
       <w:pPr>
+        <w:rPr>
+          <w:rFonts w:ascii="Times New Roman" w:eastAsia="Times New Roman" w:hAnsi="Times New Roman" w:cs="Times New Roman"/>
+          <w:b/>
+          <w:bCs/>
+          <w:sz w:val="28"/>
+          <w:szCs w:val="28"/>
+          <w:lang w:val="uk-UA" w:eastAsia="ru-RU"/>
+        </w:rPr>
+      </w:pPr>
+      <w:r>
+        <w:rPr>
+          <w:rFonts w:ascii="Times New Roman" w:eastAsia="Times New Roman" w:hAnsi="Times New Roman" w:cs="Times New Roman"/>
+          <w:b/>
+          <w:bCs/>
+          <w:sz w:val="28"/>
+          <w:szCs w:val="28"/>
+          <w:lang w:val="uk-UA" w:eastAsia="ru-RU"/>
+        </w:rPr>
+        <w:br w:type="page"/>
+      </w:r>
+    </w:p>
+    <w:p>
+      <w:pPr>
         <w:spacing w:before="100" w:beforeAutospacing="1" w:after="100" w:afterAutospacing="1" w:line="360" w:lineRule="auto"/>
         <w:jc w:val="center"/>
         <w:rPr>
           <w:rFonts w:ascii="Times New Roman" w:eastAsia="Times New Roman" w:hAnsi="Times New Roman" w:cs="Times New Roman"/>
           <w:b/>
           <w:bCs/>
-          <w:sz w:val="36"/>
-          <w:szCs w:val="36"/>
-          <w:lang w:eastAsia="ru-RU"/>
+          <w:sz w:val="28"/>
+          <w:szCs w:val="28"/>
+          <w:lang w:val="uk-UA" w:eastAsia="ru-RU"/>
         </w:rPr>
       </w:pPr>
       <w:r>
@@ -252,10 +397,11 @@
           <w:rFonts w:ascii="Times New Roman" w:eastAsia="Times New Roman" w:hAnsi="Times New Roman" w:cs="Times New Roman"/>
           <w:b/>
           <w:bCs/>
-          <w:sz w:val="36"/>
-          <w:szCs w:val="36"/>
-          <w:lang w:eastAsia="ru-RU"/>
-        </w:rPr>
+          <w:sz w:val="28"/>
+          <w:szCs w:val="28"/>
+          <w:lang w:val="uk-UA" w:eastAsia="ru-RU"/>
+        </w:rPr>
+        <w:lastRenderedPageBreak/>
         <w:t>2. Налаштування інтеграційного середовища</w:t>
       </w:r>
     </w:p>
@@ -266,17 +412,17 @@
         <w:jc w:val="both"/>
         <w:rPr>
           <w:rFonts w:ascii="Times New Roman" w:eastAsia="Times New Roman" w:hAnsi="Times New Roman" w:cs="Times New Roman"/>
-          <w:sz w:val="24"/>
-          <w:szCs w:val="24"/>
-          <w:lang w:eastAsia="ru-RU"/>
-        </w:rPr>
-      </w:pPr>
-      <w:r>
-        <w:rPr>
-          <w:rFonts w:ascii="Times New Roman" w:eastAsia="Times New Roman" w:hAnsi="Times New Roman" w:cs="Times New Roman"/>
-          <w:sz w:val="24"/>
-          <w:szCs w:val="24"/>
-          <w:lang w:eastAsia="ru-RU"/>
+          <w:sz w:val="28"/>
+          <w:szCs w:val="28"/>
+          <w:lang w:val="uk-UA" w:eastAsia="ru-RU"/>
+        </w:rPr>
+      </w:pPr>
+      <w:r>
+        <w:rPr>
+          <w:rFonts w:ascii="Times New Roman" w:eastAsia="Times New Roman" w:hAnsi="Times New Roman" w:cs="Times New Roman"/>
+          <w:sz w:val="28"/>
+          <w:szCs w:val="28"/>
+          <w:lang w:val="uk-UA" w:eastAsia="ru-RU"/>
         </w:rPr>
         <w:t>Для коректного виконання інтеграційних тестів реалізовано автоматизований механізм підготовки середовища, який перед запуском тестового набору виконує такі дії:</w:t>
       </w:r>
@@ -291,17 +437,17 @@
         <w:jc w:val="both"/>
         <w:rPr>
           <w:rFonts w:ascii="Times New Roman" w:eastAsia="Times New Roman" w:hAnsi="Times New Roman" w:cs="Times New Roman"/>
-          <w:sz w:val="24"/>
-          <w:szCs w:val="24"/>
-          <w:lang w:eastAsia="ru-RU"/>
-        </w:rPr>
-      </w:pPr>
-      <w:r>
-        <w:rPr>
-          <w:rFonts w:ascii="Times New Roman" w:eastAsia="Times New Roman" w:hAnsi="Times New Roman" w:cs="Times New Roman"/>
-          <w:sz w:val="24"/>
-          <w:szCs w:val="24"/>
-          <w:lang w:eastAsia="ru-RU"/>
+          <w:sz w:val="28"/>
+          <w:szCs w:val="28"/>
+          <w:lang w:val="uk-UA" w:eastAsia="ru-RU"/>
+        </w:rPr>
+      </w:pPr>
+      <w:r>
+        <w:rPr>
+          <w:rFonts w:ascii="Times New Roman" w:eastAsia="Times New Roman" w:hAnsi="Times New Roman" w:cs="Times New Roman"/>
+          <w:sz w:val="28"/>
+          <w:szCs w:val="28"/>
+          <w:lang w:val="uk-UA" w:eastAsia="ru-RU"/>
         </w:rPr>
         <w:t>ініціалізація застосунку з тестовою конфігурацією;</w:t>
       </w:r>
@@ -316,17 +462,17 @@
         <w:jc w:val="both"/>
         <w:rPr>
           <w:rFonts w:ascii="Times New Roman" w:eastAsia="Times New Roman" w:hAnsi="Times New Roman" w:cs="Times New Roman"/>
-          <w:sz w:val="24"/>
-          <w:szCs w:val="24"/>
-          <w:lang w:eastAsia="ru-RU"/>
-        </w:rPr>
-      </w:pPr>
-      <w:r>
-        <w:rPr>
-          <w:rFonts w:ascii="Times New Roman" w:eastAsia="Times New Roman" w:hAnsi="Times New Roman" w:cs="Times New Roman"/>
-          <w:sz w:val="24"/>
-          <w:szCs w:val="24"/>
-          <w:lang w:eastAsia="ru-RU"/>
+          <w:sz w:val="28"/>
+          <w:szCs w:val="28"/>
+          <w:lang w:val="uk-UA" w:eastAsia="ru-RU"/>
+        </w:rPr>
+      </w:pPr>
+      <w:r>
+        <w:rPr>
+          <w:rFonts w:ascii="Times New Roman" w:eastAsia="Times New Roman" w:hAnsi="Times New Roman" w:cs="Times New Roman"/>
+          <w:sz w:val="28"/>
+          <w:szCs w:val="28"/>
+          <w:lang w:val="uk-UA" w:eastAsia="ru-RU"/>
         </w:rPr>
         <w:t>встановлення з’єднання з тестовою базою даних;</w:t>
       </w:r>
@@ -341,17 +487,17 @@
         <w:jc w:val="both"/>
         <w:rPr>
           <w:rFonts w:ascii="Times New Roman" w:eastAsia="Times New Roman" w:hAnsi="Times New Roman" w:cs="Times New Roman"/>
-          <w:sz w:val="24"/>
-          <w:szCs w:val="24"/>
-          <w:lang w:eastAsia="ru-RU"/>
-        </w:rPr>
-      </w:pPr>
-      <w:r>
-        <w:rPr>
-          <w:rFonts w:ascii="Times New Roman" w:eastAsia="Times New Roman" w:hAnsi="Times New Roman" w:cs="Times New Roman"/>
-          <w:sz w:val="24"/>
-          <w:szCs w:val="24"/>
-          <w:lang w:eastAsia="ru-RU"/>
+          <w:sz w:val="28"/>
+          <w:szCs w:val="28"/>
+          <w:lang w:val="uk-UA" w:eastAsia="ru-RU"/>
+        </w:rPr>
+      </w:pPr>
+      <w:r>
+        <w:rPr>
+          <w:rFonts w:ascii="Times New Roman" w:eastAsia="Times New Roman" w:hAnsi="Times New Roman" w:cs="Times New Roman"/>
+          <w:sz w:val="28"/>
+          <w:szCs w:val="28"/>
+          <w:lang w:val="uk-UA" w:eastAsia="ru-RU"/>
         </w:rPr>
         <w:t>очищення бази даних та синхронізація структури таблиць;</w:t>
       </w:r>
@@ -366,17 +512,17 @@
         <w:jc w:val="both"/>
         <w:rPr>
           <w:rFonts w:ascii="Times New Roman" w:eastAsia="Times New Roman" w:hAnsi="Times New Roman" w:cs="Times New Roman"/>
-          <w:sz w:val="24"/>
-          <w:szCs w:val="24"/>
-          <w:lang w:eastAsia="ru-RU"/>
-        </w:rPr>
-      </w:pPr>
-      <w:r>
-        <w:rPr>
-          <w:rFonts w:ascii="Times New Roman" w:eastAsia="Times New Roman" w:hAnsi="Times New Roman" w:cs="Times New Roman"/>
-          <w:sz w:val="24"/>
-          <w:szCs w:val="24"/>
-          <w:lang w:eastAsia="ru-RU"/>
+          <w:sz w:val="28"/>
+          <w:szCs w:val="28"/>
+          <w:lang w:val="uk-UA" w:eastAsia="ru-RU"/>
+        </w:rPr>
+      </w:pPr>
+      <w:r>
+        <w:rPr>
+          <w:rFonts w:ascii="Times New Roman" w:eastAsia="Times New Roman" w:hAnsi="Times New Roman" w:cs="Times New Roman"/>
+          <w:sz w:val="28"/>
+          <w:szCs w:val="28"/>
+          <w:lang w:val="uk-UA" w:eastAsia="ru-RU"/>
         </w:rPr>
         <w:t>автоматичне створення технічного адміністративного користувача для виконання захищених запитів.</w:t>
       </w:r>
@@ -388,36 +534,56 @@
         <w:jc w:val="both"/>
         <w:rPr>
           <w:rFonts w:ascii="Times New Roman" w:eastAsia="Times New Roman" w:hAnsi="Times New Roman" w:cs="Times New Roman"/>
-          <w:sz w:val="24"/>
-          <w:szCs w:val="24"/>
-          <w:lang w:eastAsia="ru-RU"/>
-        </w:rPr>
-      </w:pPr>
-      <w:r>
-        <w:rPr>
-          <w:rFonts w:ascii="Times New Roman" w:eastAsia="Times New Roman" w:hAnsi="Times New Roman" w:cs="Times New Roman"/>
-          <w:sz w:val="24"/>
-          <w:szCs w:val="24"/>
-          <w:lang w:eastAsia="ru-RU"/>
-        </w:rPr>
-        <w:t>Це забезпечило стабільність середовища та унеможливило вплив залишкових даних між тестовими запускоми.</w:t>
+          <w:sz w:val="28"/>
+          <w:szCs w:val="28"/>
+          <w:lang w:val="uk-UA" w:eastAsia="ru-RU"/>
+        </w:rPr>
+      </w:pPr>
+      <w:r>
+        <w:rPr>
+          <w:rFonts w:ascii="Times New Roman" w:eastAsia="Times New Roman" w:hAnsi="Times New Roman" w:cs="Times New Roman"/>
+          <w:sz w:val="28"/>
+          <w:szCs w:val="28"/>
+          <w:lang w:val="uk-UA" w:eastAsia="ru-RU"/>
+        </w:rPr>
+        <w:t xml:space="preserve">Це забезпечило стабільність середовища та унеможливило вплив залишкових даних між тестовими </w:t>
+      </w:r>
+      <w:proofErr w:type="spellStart"/>
+      <w:r>
+        <w:rPr>
+          <w:rFonts w:ascii="Times New Roman" w:eastAsia="Times New Roman" w:hAnsi="Times New Roman" w:cs="Times New Roman"/>
+          <w:sz w:val="28"/>
+          <w:szCs w:val="28"/>
+          <w:lang w:val="uk-UA" w:eastAsia="ru-RU"/>
+        </w:rPr>
+        <w:t>запускоми</w:t>
+      </w:r>
+      <w:proofErr w:type="spellEnd"/>
+      <w:r>
+        <w:rPr>
+          <w:rFonts w:ascii="Times New Roman" w:eastAsia="Times New Roman" w:hAnsi="Times New Roman" w:cs="Times New Roman"/>
+          <w:sz w:val="28"/>
+          <w:szCs w:val="28"/>
+          <w:lang w:val="uk-UA" w:eastAsia="ru-RU"/>
+        </w:rPr>
+        <w:t>.</w:t>
       </w:r>
     </w:p>
     <w:p>
       <w:pPr>
         <w:rPr>
           <w:rFonts w:ascii="Times New Roman" w:eastAsia="Times New Roman" w:hAnsi="Times New Roman" w:cs="Times New Roman"/>
-          <w:sz w:val="24"/>
-          <w:szCs w:val="24"/>
-          <w:lang w:eastAsia="ru-RU"/>
-        </w:rPr>
-      </w:pPr>
-      <w:r>
-        <w:rPr>
-          <w:rFonts w:ascii="Times New Roman" w:eastAsia="Times New Roman" w:hAnsi="Times New Roman" w:cs="Times New Roman"/>
-          <w:sz w:val="24"/>
-          <w:szCs w:val="24"/>
-          <w:lang w:eastAsia="ru-RU"/>
+          <w:sz w:val="28"/>
+          <w:szCs w:val="28"/>
+          <w:lang w:val="uk-UA" w:eastAsia="ru-RU"/>
+        </w:rPr>
+      </w:pPr>
+      <w:r>
+        <w:rPr>
+          <w:rFonts w:ascii="Times New Roman" w:eastAsia="Times New Roman" w:hAnsi="Times New Roman" w:cs="Times New Roman"/>
+          <w:sz w:val="28"/>
+          <w:szCs w:val="28"/>
+          <w:lang w:val="uk-UA" w:eastAsia="ru-RU"/>
         </w:rPr>
         <w:br w:type="page"/>
       </w:r>
@@ -430,9 +596,9 @@
           <w:rFonts w:ascii="Times New Roman" w:eastAsia="Times New Roman" w:hAnsi="Times New Roman" w:cs="Times New Roman"/>
           <w:b/>
           <w:bCs/>
-          <w:sz w:val="36"/>
-          <w:szCs w:val="36"/>
-          <w:lang w:eastAsia="ru-RU"/>
+          <w:sz w:val="28"/>
+          <w:szCs w:val="28"/>
+          <w:lang w:val="uk-UA" w:eastAsia="ru-RU"/>
         </w:rPr>
       </w:pPr>
       <w:r>
@@ -440,12 +606,36 @@
           <w:rFonts w:ascii="Times New Roman" w:eastAsia="Times New Roman" w:hAnsi="Times New Roman" w:cs="Times New Roman"/>
           <w:b/>
           <w:bCs/>
-          <w:sz w:val="36"/>
-          <w:szCs w:val="36"/>
-          <w:lang w:eastAsia="ru-RU"/>
+          <w:sz w:val="28"/>
+          <w:szCs w:val="28"/>
+          <w:lang w:val="uk-UA" w:eastAsia="ru-RU"/>
         </w:rPr>
         <w:lastRenderedPageBreak/>
-        <w:t>3. End-to-End тестування</w:t>
+        <w:t xml:space="preserve">3. </w:t>
+      </w:r>
+      <w:proofErr w:type="spellStart"/>
+      <w:r>
+        <w:rPr>
+          <w:rFonts w:ascii="Times New Roman" w:eastAsia="Times New Roman" w:hAnsi="Times New Roman" w:cs="Times New Roman"/>
+          <w:b/>
+          <w:bCs/>
+          <w:sz w:val="28"/>
+          <w:szCs w:val="28"/>
+          <w:lang w:val="uk-UA" w:eastAsia="ru-RU"/>
+        </w:rPr>
+        <w:t>End-to-End</w:t>
+      </w:r>
+      <w:proofErr w:type="spellEnd"/>
+      <w:r>
+        <w:rPr>
+          <w:rFonts w:ascii="Times New Roman" w:eastAsia="Times New Roman" w:hAnsi="Times New Roman" w:cs="Times New Roman"/>
+          <w:b/>
+          <w:bCs/>
+          <w:sz w:val="28"/>
+          <w:szCs w:val="28"/>
+          <w:lang w:val="uk-UA" w:eastAsia="ru-RU"/>
+        </w:rPr>
+        <w:t xml:space="preserve"> тестування</w:t>
       </w:r>
     </w:p>
     <w:p>
@@ -455,19 +645,59 @@
         <w:jc w:val="both"/>
         <w:rPr>
           <w:rFonts w:ascii="Times New Roman" w:eastAsia="Times New Roman" w:hAnsi="Times New Roman" w:cs="Times New Roman"/>
-          <w:sz w:val="24"/>
-          <w:szCs w:val="24"/>
-          <w:lang w:eastAsia="ru-RU"/>
-        </w:rPr>
-      </w:pPr>
-      <w:r>
-        <w:rPr>
-          <w:rFonts w:ascii="Times New Roman" w:eastAsia="Times New Roman" w:hAnsi="Times New Roman" w:cs="Times New Roman"/>
-          <w:sz w:val="24"/>
-          <w:szCs w:val="24"/>
-          <w:lang w:eastAsia="ru-RU"/>
-        </w:rPr>
-        <w:t>Розроблено повний наскрізний сценарій ("Full Flow"), що повторює типовий робочий процес користувача в системі. Сценарій включає:</w:t>
+          <w:sz w:val="28"/>
+          <w:szCs w:val="28"/>
+          <w:lang w:val="uk-UA" w:eastAsia="ru-RU"/>
+        </w:rPr>
+      </w:pPr>
+      <w:r>
+        <w:rPr>
+          <w:rFonts w:ascii="Times New Roman" w:eastAsia="Times New Roman" w:hAnsi="Times New Roman" w:cs="Times New Roman"/>
+          <w:sz w:val="28"/>
+          <w:szCs w:val="28"/>
+          <w:lang w:val="uk-UA" w:eastAsia="ru-RU"/>
+        </w:rPr>
+        <w:t>Розроблено повний наскрізний сценарій ("</w:t>
+      </w:r>
+      <w:proofErr w:type="spellStart"/>
+      <w:r>
+        <w:rPr>
+          <w:rFonts w:ascii="Times New Roman" w:eastAsia="Times New Roman" w:hAnsi="Times New Roman" w:cs="Times New Roman"/>
+          <w:sz w:val="28"/>
+          <w:szCs w:val="28"/>
+          <w:lang w:val="uk-UA" w:eastAsia="ru-RU"/>
+        </w:rPr>
+        <w:t>Full</w:t>
+      </w:r>
+      <w:proofErr w:type="spellEnd"/>
+      <w:r>
+        <w:rPr>
+          <w:rFonts w:ascii="Times New Roman" w:eastAsia="Times New Roman" w:hAnsi="Times New Roman" w:cs="Times New Roman"/>
+          <w:sz w:val="28"/>
+          <w:szCs w:val="28"/>
+          <w:lang w:val="uk-UA" w:eastAsia="ru-RU"/>
+        </w:rPr>
+        <w:t xml:space="preserve"> </w:t>
+      </w:r>
+      <w:proofErr w:type="spellStart"/>
+      <w:r>
+        <w:rPr>
+          <w:rFonts w:ascii="Times New Roman" w:eastAsia="Times New Roman" w:hAnsi="Times New Roman" w:cs="Times New Roman"/>
+          <w:sz w:val="28"/>
+          <w:szCs w:val="28"/>
+          <w:lang w:val="uk-UA" w:eastAsia="ru-RU"/>
+        </w:rPr>
+        <w:t>Flow</w:t>
+      </w:r>
+      <w:proofErr w:type="spellEnd"/>
+      <w:r>
+        <w:rPr>
+          <w:rFonts w:ascii="Times New Roman" w:eastAsia="Times New Roman" w:hAnsi="Times New Roman" w:cs="Times New Roman"/>
+          <w:sz w:val="28"/>
+          <w:szCs w:val="28"/>
+          <w:lang w:val="uk-UA" w:eastAsia="ru-RU"/>
+        </w:rPr>
+        <w:t>"), що повторює типовий робочий процес користувача в системі. Сценарій включає:</w:t>
       </w:r>
     </w:p>
     <w:p>
@@ -476,49 +706,54 @@
           <w:ilvl w:val="0"/>
           <w:numId w:val="13"/>
         </w:numPr>
+        <w:tabs>
+          <w:tab w:val="clear" w:pos="720"/>
+          <w:tab w:val="num" w:pos="360"/>
+        </w:tabs>
         <w:spacing w:before="100" w:beforeAutospacing="1" w:after="100" w:afterAutospacing="1" w:line="360" w:lineRule="auto"/>
+        <w:ind w:left="0" w:firstLine="709"/>
         <w:jc w:val="both"/>
         <w:rPr>
           <w:rFonts w:ascii="Times New Roman" w:eastAsia="Times New Roman" w:hAnsi="Times New Roman" w:cs="Times New Roman"/>
-          <w:sz w:val="24"/>
-          <w:szCs w:val="24"/>
-          <w:lang w:eastAsia="ru-RU"/>
+          <w:sz w:val="28"/>
+          <w:szCs w:val="28"/>
+          <w:lang w:val="uk-UA" w:eastAsia="ru-RU"/>
         </w:rPr>
       </w:pPr>
       <w:r>
         <w:rPr>
           <w:rFonts w:ascii="Times New Roman" w:eastAsia="Times New Roman" w:hAnsi="Times New Roman" w:cs="Times New Roman"/>
           <w:bCs/>
-          <w:sz w:val="24"/>
-          <w:szCs w:val="24"/>
-          <w:lang w:eastAsia="ru-RU"/>
+          <w:sz w:val="28"/>
+          <w:szCs w:val="28"/>
+          <w:lang w:val="uk-UA" w:eastAsia="ru-RU"/>
         </w:rPr>
         <w:t>Авторизацію</w:t>
       </w:r>
       <w:r>
         <w:rPr>
           <w:rFonts w:ascii="Times New Roman" w:eastAsia="Times New Roman" w:hAnsi="Times New Roman" w:cs="Times New Roman"/>
-          <w:sz w:val="24"/>
-          <w:szCs w:val="24"/>
-          <w:lang w:eastAsia="ru-RU"/>
+          <w:sz w:val="28"/>
+          <w:szCs w:val="28"/>
+          <w:lang w:val="uk-UA" w:eastAsia="ru-RU"/>
         </w:rPr>
         <w:t xml:space="preserve"> </w:t>
       </w:r>
       <w:r>
         <w:rPr>
           <w:rFonts w:ascii="Times New Roman" w:eastAsia="Times New Roman" w:hAnsi="Times New Roman" w:cs="Times New Roman"/>
-          <w:sz w:val="24"/>
-          <w:szCs w:val="24"/>
-          <w:lang w:eastAsia="ru-RU"/>
+          <w:sz w:val="28"/>
+          <w:szCs w:val="28"/>
+          <w:lang w:val="uk-UA" w:eastAsia="ru-RU"/>
         </w:rPr>
         <w:t xml:space="preserve">– </w:t>
       </w:r>
       <w:r>
         <w:rPr>
           <w:rFonts w:ascii="Times New Roman" w:eastAsia="Times New Roman" w:hAnsi="Times New Roman" w:cs="Times New Roman"/>
-          <w:sz w:val="24"/>
-          <w:szCs w:val="24"/>
-          <w:lang w:eastAsia="ru-RU"/>
+          <w:sz w:val="28"/>
+          <w:szCs w:val="28"/>
+          <w:lang w:val="uk-UA" w:eastAsia="ru-RU"/>
         </w:rPr>
         <w:t xml:space="preserve"> отримання токена адміністратора через API.</w:t>
       </w:r>
@@ -529,42 +764,67 @@
           <w:ilvl w:val="0"/>
           <w:numId w:val="13"/>
         </w:numPr>
+        <w:tabs>
+          <w:tab w:val="clear" w:pos="720"/>
+          <w:tab w:val="num" w:pos="360"/>
+        </w:tabs>
         <w:spacing w:before="100" w:beforeAutospacing="1" w:after="100" w:afterAutospacing="1" w:line="360" w:lineRule="auto"/>
+        <w:ind w:left="0" w:firstLine="709"/>
         <w:jc w:val="both"/>
         <w:rPr>
           <w:rFonts w:ascii="Times New Roman" w:eastAsia="Times New Roman" w:hAnsi="Times New Roman" w:cs="Times New Roman"/>
-          <w:sz w:val="24"/>
-          <w:szCs w:val="24"/>
-          <w:lang w:eastAsia="ru-RU"/>
+          <w:sz w:val="28"/>
+          <w:szCs w:val="28"/>
+          <w:lang w:val="uk-UA" w:eastAsia="ru-RU"/>
         </w:rPr>
       </w:pPr>
       <w:r>
         <w:rPr>
           <w:rFonts w:ascii="Times New Roman" w:eastAsia="Times New Roman" w:hAnsi="Times New Roman" w:cs="Times New Roman"/>
           <w:bCs/>
-          <w:sz w:val="24"/>
-          <w:szCs w:val="24"/>
-          <w:lang w:eastAsia="ru-RU"/>
+          <w:sz w:val="28"/>
+          <w:szCs w:val="28"/>
+          <w:lang w:val="uk-UA" w:eastAsia="ru-RU"/>
         </w:rPr>
         <w:t>Підготовку даних</w:t>
       </w:r>
       <w:r>
         <w:rPr>
           <w:rFonts w:ascii="Times New Roman" w:eastAsia="Times New Roman" w:hAnsi="Times New Roman" w:cs="Times New Roman"/>
-          <w:sz w:val="24"/>
-          <w:szCs w:val="24"/>
-          <w:lang w:eastAsia="ru-RU"/>
+          <w:sz w:val="28"/>
+          <w:szCs w:val="28"/>
+          <w:lang w:val="uk-UA" w:eastAsia="ru-RU"/>
         </w:rPr>
         <w:t xml:space="preserve"> –</w:t>
       </w:r>
       <w:r>
         <w:rPr>
           <w:rFonts w:ascii="Times New Roman" w:eastAsia="Times New Roman" w:hAnsi="Times New Roman" w:cs="Times New Roman"/>
-          <w:sz w:val="24"/>
-          <w:szCs w:val="24"/>
-          <w:lang w:eastAsia="ru-RU"/>
-        </w:rPr>
-        <w:t xml:space="preserve"> створення товару та створення закладу (Establishment).</w:t>
+          <w:sz w:val="28"/>
+          <w:szCs w:val="28"/>
+          <w:lang w:val="uk-UA" w:eastAsia="ru-RU"/>
+        </w:rPr>
+        <w:t xml:space="preserve"> створення товару та створення закладу (</w:t>
+      </w:r>
+      <w:proofErr w:type="spellStart"/>
+      <w:r>
+        <w:rPr>
+          <w:rFonts w:ascii="Times New Roman" w:eastAsia="Times New Roman" w:hAnsi="Times New Roman" w:cs="Times New Roman"/>
+          <w:sz w:val="28"/>
+          <w:szCs w:val="28"/>
+          <w:lang w:val="uk-UA" w:eastAsia="ru-RU"/>
+        </w:rPr>
+        <w:t>Establishment</w:t>
+      </w:r>
+      <w:proofErr w:type="spellEnd"/>
+      <w:r>
+        <w:rPr>
+          <w:rFonts w:ascii="Times New Roman" w:eastAsia="Times New Roman" w:hAnsi="Times New Roman" w:cs="Times New Roman"/>
+          <w:sz w:val="28"/>
+          <w:szCs w:val="28"/>
+          <w:lang w:val="uk-UA" w:eastAsia="ru-RU"/>
+        </w:rPr>
+        <w:t>).</w:t>
       </w:r>
     </w:p>
     <w:p>
@@ -573,40 +833,45 @@
           <w:ilvl w:val="0"/>
           <w:numId w:val="13"/>
         </w:numPr>
+        <w:tabs>
+          <w:tab w:val="clear" w:pos="720"/>
+          <w:tab w:val="num" w:pos="360"/>
+        </w:tabs>
         <w:spacing w:before="100" w:beforeAutospacing="1" w:after="100" w:afterAutospacing="1" w:line="360" w:lineRule="auto"/>
+        <w:ind w:left="0" w:firstLine="709"/>
         <w:jc w:val="both"/>
         <w:rPr>
           <w:rFonts w:ascii="Times New Roman" w:eastAsia="Times New Roman" w:hAnsi="Times New Roman" w:cs="Times New Roman"/>
-          <w:sz w:val="24"/>
-          <w:szCs w:val="24"/>
-          <w:lang w:eastAsia="ru-RU"/>
+          <w:sz w:val="28"/>
+          <w:szCs w:val="28"/>
+          <w:lang w:val="uk-UA" w:eastAsia="ru-RU"/>
         </w:rPr>
       </w:pPr>
       <w:r>
         <w:rPr>
           <w:rFonts w:ascii="Times New Roman" w:eastAsia="Times New Roman" w:hAnsi="Times New Roman" w:cs="Times New Roman"/>
           <w:bCs/>
-          <w:sz w:val="24"/>
-          <w:szCs w:val="24"/>
-          <w:lang w:eastAsia="ru-RU"/>
+          <w:sz w:val="28"/>
+          <w:szCs w:val="28"/>
+          <w:lang w:val="uk-UA" w:eastAsia="ru-RU"/>
         </w:rPr>
         <w:t>Бізнес-процес</w:t>
       </w:r>
       <w:r>
         <w:rPr>
           <w:rFonts w:ascii="Times New Roman" w:eastAsia="Times New Roman" w:hAnsi="Times New Roman" w:cs="Times New Roman"/>
-          <w:sz w:val="24"/>
-          <w:szCs w:val="24"/>
-          <w:lang w:eastAsia="ru-RU"/>
+          <w:sz w:val="28"/>
+          <w:szCs w:val="28"/>
+          <w:lang w:val="uk-UA" w:eastAsia="ru-RU"/>
         </w:rPr>
         <w:t xml:space="preserve"> –</w:t>
       </w:r>
       <w:r>
         <w:rPr>
           <w:rFonts w:ascii="Times New Roman" w:eastAsia="Times New Roman" w:hAnsi="Times New Roman" w:cs="Times New Roman"/>
-          <w:sz w:val="24"/>
-          <w:szCs w:val="24"/>
-          <w:lang w:eastAsia="ru-RU"/>
+          <w:sz w:val="28"/>
+          <w:szCs w:val="28"/>
+          <w:lang w:val="uk-UA" w:eastAsia="ru-RU"/>
         </w:rPr>
         <w:t xml:space="preserve"> формування замовлення та додавання в нього товарів.</w:t>
       </w:r>
@@ -617,40 +882,45 @@
           <w:ilvl w:val="0"/>
           <w:numId w:val="13"/>
         </w:numPr>
+        <w:tabs>
+          <w:tab w:val="clear" w:pos="720"/>
+          <w:tab w:val="num" w:pos="360"/>
+        </w:tabs>
         <w:spacing w:before="100" w:beforeAutospacing="1" w:after="100" w:afterAutospacing="1" w:line="360" w:lineRule="auto"/>
+        <w:ind w:left="0" w:firstLine="709"/>
         <w:jc w:val="both"/>
         <w:rPr>
           <w:rFonts w:ascii="Times New Roman" w:eastAsia="Times New Roman" w:hAnsi="Times New Roman" w:cs="Times New Roman"/>
-          <w:sz w:val="24"/>
-          <w:szCs w:val="24"/>
-          <w:lang w:eastAsia="ru-RU"/>
+          <w:sz w:val="28"/>
+          <w:szCs w:val="28"/>
+          <w:lang w:val="uk-UA" w:eastAsia="ru-RU"/>
         </w:rPr>
       </w:pPr>
       <w:r>
         <w:rPr>
           <w:rFonts w:ascii="Times New Roman" w:eastAsia="Times New Roman" w:hAnsi="Times New Roman" w:cs="Times New Roman"/>
           <w:bCs/>
-          <w:sz w:val="24"/>
-          <w:szCs w:val="24"/>
-          <w:lang w:eastAsia="ru-RU"/>
+          <w:sz w:val="28"/>
+          <w:szCs w:val="28"/>
+          <w:lang w:val="uk-UA" w:eastAsia="ru-RU"/>
         </w:rPr>
         <w:t>Перевірку результатів</w:t>
       </w:r>
       <w:r>
         <w:rPr>
           <w:rFonts w:ascii="Times New Roman" w:eastAsia="Times New Roman" w:hAnsi="Times New Roman" w:cs="Times New Roman"/>
-          <w:sz w:val="24"/>
-          <w:szCs w:val="24"/>
-          <w:lang w:eastAsia="ru-RU"/>
+          <w:sz w:val="28"/>
+          <w:szCs w:val="28"/>
+          <w:lang w:val="uk-UA" w:eastAsia="ru-RU"/>
         </w:rPr>
         <w:t xml:space="preserve"> – </w:t>
       </w:r>
       <w:r>
         <w:rPr>
           <w:rFonts w:ascii="Times New Roman" w:eastAsia="Times New Roman" w:hAnsi="Times New Roman" w:cs="Times New Roman"/>
-          <w:sz w:val="24"/>
-          <w:szCs w:val="24"/>
-          <w:lang w:eastAsia="ru-RU"/>
+          <w:sz w:val="28"/>
+          <w:szCs w:val="28"/>
+          <w:lang w:val="uk-UA" w:eastAsia="ru-RU"/>
         </w:rPr>
         <w:t>отримання повної інформації про створене замовлення: коректність статусу, прив’язки до закладу та списку товарів.</w:t>
       </w:r>
@@ -662,32 +932,91 @@
         <w:jc w:val="both"/>
         <w:rPr>
           <w:rFonts w:ascii="Times New Roman" w:eastAsia="Times New Roman" w:hAnsi="Times New Roman" w:cs="Times New Roman"/>
-          <w:sz w:val="24"/>
-          <w:szCs w:val="24"/>
+          <w:sz w:val="28"/>
+          <w:szCs w:val="28"/>
+          <w:lang w:val="uk-UA" w:eastAsia="ru-RU"/>
+        </w:rPr>
+      </w:pPr>
+      <w:r>
+        <w:rPr>
+          <w:rFonts w:ascii="Times New Roman" w:eastAsia="Times New Roman" w:hAnsi="Times New Roman" w:cs="Times New Roman"/>
+          <w:sz w:val="28"/>
+          <w:szCs w:val="28"/>
+          <w:lang w:val="uk-UA" w:eastAsia="ru-RU"/>
+        </w:rPr>
+        <w:t xml:space="preserve">Тест підтверджує правильність роботи всієї системи в зв’язці: контролери </w:t>
+      </w:r>
+      <w:r>
+        <w:rPr>
+          <w:rFonts w:ascii="Times New Roman" w:eastAsia="Times New Roman" w:hAnsi="Times New Roman" w:cs="Times New Roman"/>
+          <w:sz w:val="28"/>
+          <w:szCs w:val="28"/>
           <w:lang w:eastAsia="ru-RU"/>
         </w:rPr>
-      </w:pPr>
-      <w:r>
-        <w:rPr>
-          <w:rFonts w:ascii="Times New Roman" w:eastAsia="Times New Roman" w:hAnsi="Times New Roman" w:cs="Times New Roman"/>
-          <w:sz w:val="24"/>
-          <w:szCs w:val="24"/>
+        <w:t>-</w:t>
+      </w:r>
+      <w:r>
+        <w:rPr>
+          <w:rFonts w:ascii="Times New Roman" w:eastAsia="Times New Roman" w:hAnsi="Times New Roman" w:cs="Times New Roman"/>
+          <w:sz w:val="28"/>
+          <w:szCs w:val="28"/>
+          <w:lang w:val="uk-UA" w:eastAsia="ru-RU"/>
+        </w:rPr>
+        <w:t xml:space="preserve"> сервіси </w:t>
+      </w:r>
+      <w:r>
+        <w:rPr>
+          <w:rFonts w:ascii="Times New Roman" w:eastAsia="Times New Roman" w:hAnsi="Times New Roman" w:cs="Times New Roman"/>
+          <w:sz w:val="28"/>
+          <w:szCs w:val="28"/>
           <w:lang w:eastAsia="ru-RU"/>
         </w:rPr>
-        <w:t>Тест підтверджує правильність роботи всієї системи в зв’язці: контролери → сервіси → база даних.</w:t>
+        <w:t xml:space="preserve">- </w:t>
+      </w:r>
+      <w:r>
+        <w:rPr>
+          <w:rFonts w:ascii="Times New Roman" w:eastAsia="Times New Roman" w:hAnsi="Times New Roman" w:cs="Times New Roman"/>
+          <w:sz w:val="28"/>
+          <w:szCs w:val="28"/>
+          <w:lang w:val="uk-UA" w:eastAsia="ru-RU"/>
+        </w:rPr>
+        <w:t>база даних.</w:t>
       </w:r>
     </w:p>
     <w:p>
       <w:pPr>
+        <w:rPr>
+          <w:rFonts w:ascii="Times New Roman" w:eastAsia="Times New Roman" w:hAnsi="Times New Roman" w:cs="Times New Roman"/>
+          <w:b/>
+          <w:bCs/>
+          <w:sz w:val="28"/>
+          <w:szCs w:val="28"/>
+          <w:lang w:val="uk-UA" w:eastAsia="ru-RU"/>
+        </w:rPr>
+      </w:pPr>
+      <w:r>
+        <w:rPr>
+          <w:rFonts w:ascii="Times New Roman" w:eastAsia="Times New Roman" w:hAnsi="Times New Roman" w:cs="Times New Roman"/>
+          <w:b/>
+          <w:bCs/>
+          <w:sz w:val="28"/>
+          <w:szCs w:val="28"/>
+          <w:lang w:val="uk-UA" w:eastAsia="ru-RU"/>
+        </w:rPr>
+        <w:br w:type="page"/>
+      </w:r>
+    </w:p>
+    <w:p>
+      <w:pPr>
         <w:spacing w:before="100" w:beforeAutospacing="1" w:after="100" w:afterAutospacing="1" w:line="360" w:lineRule="auto"/>
         <w:jc w:val="center"/>
         <w:rPr>
           <w:rFonts w:ascii="Times New Roman" w:eastAsia="Times New Roman" w:hAnsi="Times New Roman" w:cs="Times New Roman"/>
           <w:b/>
           <w:bCs/>
-          <w:sz w:val="36"/>
-          <w:szCs w:val="36"/>
-          <w:lang w:eastAsia="ru-RU"/>
+          <w:sz w:val="28"/>
+          <w:szCs w:val="28"/>
+          <w:lang w:val="uk-UA" w:eastAsia="ru-RU"/>
         </w:rPr>
       </w:pPr>
       <w:r>
@@ -695,10 +1024,11 @@
           <w:rFonts w:ascii="Times New Roman" w:eastAsia="Times New Roman" w:hAnsi="Times New Roman" w:cs="Times New Roman"/>
           <w:b/>
           <w:bCs/>
-          <w:sz w:val="36"/>
-          <w:szCs w:val="36"/>
-          <w:lang w:eastAsia="ru-RU"/>
-        </w:rPr>
+          <w:sz w:val="28"/>
+          <w:szCs w:val="28"/>
+          <w:lang w:val="uk-UA" w:eastAsia="ru-RU"/>
+        </w:rPr>
+        <w:lastRenderedPageBreak/>
         <w:t>4. Мутаційне тестування</w:t>
       </w:r>
     </w:p>
@@ -709,37 +1039,77 @@
         <w:jc w:val="both"/>
         <w:rPr>
           <w:rFonts w:ascii="Times New Roman" w:eastAsia="Times New Roman" w:hAnsi="Times New Roman" w:cs="Times New Roman"/>
-          <w:sz w:val="24"/>
-          <w:szCs w:val="24"/>
-          <w:lang w:eastAsia="ru-RU"/>
-        </w:rPr>
-      </w:pPr>
-      <w:r>
-        <w:rPr>
-          <w:rFonts w:ascii="Times New Roman" w:eastAsia="Times New Roman" w:hAnsi="Times New Roman" w:cs="Times New Roman"/>
-          <w:sz w:val="24"/>
-          <w:szCs w:val="24"/>
-          <w:lang w:eastAsia="ru-RU"/>
-        </w:rPr>
-        <w:t>Для оцінки якості існуючих тестів застосовано інструмент Stryk</w:t>
-      </w:r>
-      <w:r>
-        <w:rPr>
-          <w:rFonts w:ascii="Times New Roman" w:eastAsia="Times New Roman" w:hAnsi="Times New Roman" w:cs="Times New Roman"/>
-          <w:sz w:val="24"/>
-          <w:szCs w:val="24"/>
-          <w:lang w:eastAsia="ru-RU"/>
-        </w:rPr>
-        <w:t>er. Конфігурація охоплює сервіс та контролер</w:t>
-      </w:r>
-      <w:r>
-        <w:rPr>
-          <w:rFonts w:ascii="Times New Roman" w:eastAsia="Times New Roman" w:hAnsi="Times New Roman" w:cs="Times New Roman"/>
-          <w:sz w:val="24"/>
-          <w:szCs w:val="24"/>
-          <w:lang w:eastAsia="ru-RU"/>
-        </w:rPr>
-        <w:t xml:space="preserve"> модуля Product. Проведене тестування передбачало:</w:t>
+          <w:sz w:val="28"/>
+          <w:szCs w:val="28"/>
+          <w:lang w:val="uk-UA" w:eastAsia="ru-RU"/>
+        </w:rPr>
+      </w:pPr>
+      <w:r>
+        <w:rPr>
+          <w:rFonts w:ascii="Times New Roman" w:eastAsia="Times New Roman" w:hAnsi="Times New Roman" w:cs="Times New Roman"/>
+          <w:sz w:val="28"/>
+          <w:szCs w:val="28"/>
+          <w:lang w:val="uk-UA" w:eastAsia="ru-RU"/>
+        </w:rPr>
+        <w:t xml:space="preserve">Для оцінки якості існуючих тестів застосовано інструмент </w:t>
+      </w:r>
+      <w:proofErr w:type="spellStart"/>
+      <w:r>
+        <w:rPr>
+          <w:rFonts w:ascii="Times New Roman" w:eastAsia="Times New Roman" w:hAnsi="Times New Roman" w:cs="Times New Roman"/>
+          <w:sz w:val="28"/>
+          <w:szCs w:val="28"/>
+          <w:lang w:val="uk-UA" w:eastAsia="ru-RU"/>
+        </w:rPr>
+        <w:t>Stryk</w:t>
+      </w:r>
+      <w:r>
+        <w:rPr>
+          <w:rFonts w:ascii="Times New Roman" w:eastAsia="Times New Roman" w:hAnsi="Times New Roman" w:cs="Times New Roman"/>
+          <w:sz w:val="28"/>
+          <w:szCs w:val="28"/>
+          <w:lang w:val="uk-UA" w:eastAsia="ru-RU"/>
+        </w:rPr>
+        <w:t>er</w:t>
+      </w:r>
+      <w:proofErr w:type="spellEnd"/>
+      <w:r>
+        <w:rPr>
+          <w:rFonts w:ascii="Times New Roman" w:eastAsia="Times New Roman" w:hAnsi="Times New Roman" w:cs="Times New Roman"/>
+          <w:sz w:val="28"/>
+          <w:szCs w:val="28"/>
+          <w:lang w:val="uk-UA" w:eastAsia="ru-RU"/>
+        </w:rPr>
+        <w:t>. Конфігурація охоплює сервіс та контролер</w:t>
+      </w:r>
+      <w:r>
+        <w:rPr>
+          <w:rFonts w:ascii="Times New Roman" w:eastAsia="Times New Roman" w:hAnsi="Times New Roman" w:cs="Times New Roman"/>
+          <w:sz w:val="28"/>
+          <w:szCs w:val="28"/>
+          <w:lang w:val="uk-UA" w:eastAsia="ru-RU"/>
+        </w:rPr>
+        <w:t xml:space="preserve"> модуля </w:t>
+      </w:r>
+      <w:proofErr w:type="spellStart"/>
+      <w:r>
+        <w:rPr>
+          <w:rFonts w:ascii="Times New Roman" w:eastAsia="Times New Roman" w:hAnsi="Times New Roman" w:cs="Times New Roman"/>
+          <w:sz w:val="28"/>
+          <w:szCs w:val="28"/>
+          <w:lang w:val="uk-UA" w:eastAsia="ru-RU"/>
+        </w:rPr>
+        <w:t>Product</w:t>
+      </w:r>
+      <w:proofErr w:type="spellEnd"/>
+      <w:r>
+        <w:rPr>
+          <w:rFonts w:ascii="Times New Roman" w:eastAsia="Times New Roman" w:hAnsi="Times New Roman" w:cs="Times New Roman"/>
+          <w:sz w:val="28"/>
+          <w:szCs w:val="28"/>
+          <w:lang w:val="uk-UA" w:eastAsia="ru-RU"/>
+        </w:rPr>
+        <w:t>. Проведене тестування передбачало:</w:t>
       </w:r>
     </w:p>
     <w:p>
@@ -748,21 +1118,25 @@
           <w:ilvl w:val="0"/>
           <w:numId w:val="14"/>
         </w:numPr>
+        <w:tabs>
+          <w:tab w:val="clear" w:pos="720"/>
+        </w:tabs>
         <w:spacing w:before="100" w:beforeAutospacing="1" w:after="100" w:afterAutospacing="1" w:line="360" w:lineRule="auto"/>
+        <w:ind w:left="0" w:firstLine="709"/>
         <w:jc w:val="both"/>
         <w:rPr>
           <w:rFonts w:ascii="Times New Roman" w:eastAsia="Times New Roman" w:hAnsi="Times New Roman" w:cs="Times New Roman"/>
-          <w:sz w:val="24"/>
-          <w:szCs w:val="24"/>
-          <w:lang w:eastAsia="ru-RU"/>
-        </w:rPr>
-      </w:pPr>
-      <w:r>
-        <w:rPr>
-          <w:rFonts w:ascii="Times New Roman" w:eastAsia="Times New Roman" w:hAnsi="Times New Roman" w:cs="Times New Roman"/>
-          <w:sz w:val="24"/>
-          <w:szCs w:val="24"/>
-          <w:lang w:eastAsia="ru-RU"/>
+          <w:sz w:val="28"/>
+          <w:szCs w:val="28"/>
+          <w:lang w:val="uk-UA" w:eastAsia="ru-RU"/>
+        </w:rPr>
+      </w:pPr>
+      <w:r>
+        <w:rPr>
+          <w:rFonts w:ascii="Times New Roman" w:eastAsia="Times New Roman" w:hAnsi="Times New Roman" w:cs="Times New Roman"/>
+          <w:sz w:val="28"/>
+          <w:szCs w:val="28"/>
+          <w:lang w:val="uk-UA" w:eastAsia="ru-RU"/>
         </w:rPr>
         <w:t>автоматичну генерацію мутацій у вихідному коді;</w:t>
       </w:r>
@@ -773,39 +1147,63 @@
           <w:ilvl w:val="0"/>
           <w:numId w:val="14"/>
         </w:numPr>
+        <w:tabs>
+          <w:tab w:val="clear" w:pos="720"/>
+        </w:tabs>
         <w:spacing w:before="100" w:beforeAutospacing="1" w:after="100" w:afterAutospacing="1" w:line="360" w:lineRule="auto"/>
+        <w:ind w:left="0" w:firstLine="709"/>
         <w:jc w:val="both"/>
         <w:rPr>
           <w:rFonts w:ascii="Times New Roman" w:eastAsia="Times New Roman" w:hAnsi="Times New Roman" w:cs="Times New Roman"/>
-          <w:sz w:val="24"/>
-          <w:szCs w:val="24"/>
-          <w:lang w:eastAsia="ru-RU"/>
-        </w:rPr>
-      </w:pPr>
-      <w:r>
-        <w:rPr>
-          <w:rFonts w:ascii="Times New Roman" w:eastAsia="Times New Roman" w:hAnsi="Times New Roman" w:cs="Times New Roman"/>
-          <w:sz w:val="24"/>
-          <w:szCs w:val="24"/>
-          <w:lang w:eastAsia="ru-RU"/>
-        </w:rPr>
-        <w:t xml:space="preserve">запуск усіх Unit тестів </w:t>
-      </w:r>
-      <w:r>
-        <w:rPr>
-          <w:rFonts w:ascii="Times New Roman" w:eastAsia="Times New Roman" w:hAnsi="Times New Roman" w:cs="Times New Roman"/>
-          <w:sz w:val="24"/>
-          <w:szCs w:val="24"/>
-          <w:lang w:eastAsia="ru-RU"/>
+          <w:sz w:val="28"/>
+          <w:szCs w:val="28"/>
+          <w:lang w:val="uk-UA" w:eastAsia="ru-RU"/>
+        </w:rPr>
+      </w:pPr>
+      <w:r>
+        <w:rPr>
+          <w:rFonts w:ascii="Times New Roman" w:eastAsia="Times New Roman" w:hAnsi="Times New Roman" w:cs="Times New Roman"/>
+          <w:sz w:val="28"/>
+          <w:szCs w:val="28"/>
+          <w:lang w:val="uk-UA" w:eastAsia="ru-RU"/>
+        </w:rPr>
+        <w:t xml:space="preserve">запуск усіх </w:t>
+      </w:r>
+      <w:proofErr w:type="spellStart"/>
+      <w:r>
+        <w:rPr>
+          <w:rFonts w:ascii="Times New Roman" w:eastAsia="Times New Roman" w:hAnsi="Times New Roman" w:cs="Times New Roman"/>
+          <w:sz w:val="28"/>
+          <w:szCs w:val="28"/>
+          <w:lang w:val="uk-UA" w:eastAsia="ru-RU"/>
+        </w:rPr>
+        <w:t>Unit</w:t>
+      </w:r>
+      <w:proofErr w:type="spellEnd"/>
+      <w:r>
+        <w:rPr>
+          <w:rFonts w:ascii="Times New Roman" w:eastAsia="Times New Roman" w:hAnsi="Times New Roman" w:cs="Times New Roman"/>
+          <w:sz w:val="28"/>
+          <w:szCs w:val="28"/>
+          <w:lang w:val="uk-UA" w:eastAsia="ru-RU"/>
+        </w:rPr>
+        <w:t xml:space="preserve"> тестів </w:t>
+      </w:r>
+      <w:r>
+        <w:rPr>
+          <w:rFonts w:ascii="Times New Roman" w:eastAsia="Times New Roman" w:hAnsi="Times New Roman" w:cs="Times New Roman"/>
+          <w:sz w:val="28"/>
+          <w:szCs w:val="28"/>
+          <w:lang w:val="uk-UA" w:eastAsia="ru-RU"/>
         </w:rPr>
         <w:t>на</w:t>
       </w:r>
       <w:r>
         <w:rPr>
           <w:rFonts w:ascii="Times New Roman" w:eastAsia="Times New Roman" w:hAnsi="Times New Roman" w:cs="Times New Roman"/>
-          <w:sz w:val="24"/>
-          <w:szCs w:val="24"/>
-          <w:lang w:eastAsia="ru-RU"/>
+          <w:sz w:val="28"/>
+          <w:szCs w:val="28"/>
+          <w:lang w:val="uk-UA" w:eastAsia="ru-RU"/>
         </w:rPr>
         <w:t xml:space="preserve"> змінених версій;</w:t>
       </w:r>
@@ -816,23 +1214,47 @@
           <w:ilvl w:val="0"/>
           <w:numId w:val="14"/>
         </w:numPr>
+        <w:tabs>
+          <w:tab w:val="clear" w:pos="720"/>
+        </w:tabs>
         <w:spacing w:before="100" w:beforeAutospacing="1" w:after="100" w:afterAutospacing="1" w:line="360" w:lineRule="auto"/>
+        <w:ind w:left="0" w:firstLine="709"/>
         <w:jc w:val="both"/>
         <w:rPr>
           <w:rFonts w:ascii="Times New Roman" w:eastAsia="Times New Roman" w:hAnsi="Times New Roman" w:cs="Times New Roman"/>
-          <w:sz w:val="24"/>
-          <w:szCs w:val="24"/>
-          <w:lang w:eastAsia="ru-RU"/>
-        </w:rPr>
-      </w:pPr>
-      <w:r>
-        <w:rPr>
-          <w:rFonts w:ascii="Times New Roman" w:eastAsia="Times New Roman" w:hAnsi="Times New Roman" w:cs="Times New Roman"/>
-          <w:sz w:val="24"/>
-          <w:szCs w:val="24"/>
-          <w:lang w:eastAsia="ru-RU"/>
-        </w:rPr>
-        <w:t>перевірку, чи здатні тести виявити "мутовані" помилки.</w:t>
+          <w:sz w:val="28"/>
+          <w:szCs w:val="28"/>
+          <w:lang w:val="uk-UA" w:eastAsia="ru-RU"/>
+        </w:rPr>
+      </w:pPr>
+      <w:r>
+        <w:rPr>
+          <w:rFonts w:ascii="Times New Roman" w:eastAsia="Times New Roman" w:hAnsi="Times New Roman" w:cs="Times New Roman"/>
+          <w:sz w:val="28"/>
+          <w:szCs w:val="28"/>
+          <w:lang w:val="uk-UA" w:eastAsia="ru-RU"/>
+        </w:rPr>
+        <w:t>перевірку, чи здатні тести виявити "</w:t>
+      </w:r>
+      <w:proofErr w:type="spellStart"/>
+      <w:r>
+        <w:rPr>
+          <w:rFonts w:ascii="Times New Roman" w:eastAsia="Times New Roman" w:hAnsi="Times New Roman" w:cs="Times New Roman"/>
+          <w:sz w:val="28"/>
+          <w:szCs w:val="28"/>
+          <w:lang w:val="uk-UA" w:eastAsia="ru-RU"/>
+        </w:rPr>
+        <w:t>мутовані</w:t>
+      </w:r>
+      <w:proofErr w:type="spellEnd"/>
+      <w:r>
+        <w:rPr>
+          <w:rFonts w:ascii="Times New Roman" w:eastAsia="Times New Roman" w:hAnsi="Times New Roman" w:cs="Times New Roman"/>
+          <w:sz w:val="28"/>
+          <w:szCs w:val="28"/>
+          <w:lang w:val="uk-UA" w:eastAsia="ru-RU"/>
+        </w:rPr>
+        <w:t>" помилки.</w:t>
       </w:r>
     </w:p>
     <w:p>
@@ -842,35 +1264,35 @@
         <w:jc w:val="both"/>
         <w:rPr>
           <w:rFonts w:ascii="Times New Roman" w:eastAsia="Times New Roman" w:hAnsi="Times New Roman" w:cs="Times New Roman"/>
-          <w:sz w:val="24"/>
-          <w:szCs w:val="24"/>
-          <w:lang w:eastAsia="ru-RU"/>
-        </w:rPr>
-      </w:pPr>
-      <w:r>
-        <w:rPr>
-          <w:rFonts w:ascii="Times New Roman" w:eastAsia="Times New Roman" w:hAnsi="Times New Roman" w:cs="Times New Roman"/>
-          <w:sz w:val="24"/>
-          <w:szCs w:val="24"/>
-          <w:lang w:eastAsia="ru-RU"/>
+          <w:sz w:val="28"/>
+          <w:szCs w:val="28"/>
+          <w:lang w:val="uk-UA" w:eastAsia="ru-RU"/>
+        </w:rPr>
+      </w:pPr>
+      <w:r>
+        <w:rPr>
+          <w:rFonts w:ascii="Times New Roman" w:eastAsia="Times New Roman" w:hAnsi="Times New Roman" w:cs="Times New Roman"/>
+          <w:sz w:val="28"/>
+          <w:szCs w:val="28"/>
+          <w:lang w:val="uk-UA" w:eastAsia="ru-RU"/>
         </w:rPr>
         <w:t xml:space="preserve">Отримані результати показали </w:t>
       </w:r>
       <w:r>
         <w:rPr>
           <w:rFonts w:ascii="Times New Roman" w:eastAsia="Times New Roman" w:hAnsi="Times New Roman" w:cs="Times New Roman"/>
-          <w:sz w:val="24"/>
-          <w:szCs w:val="24"/>
-          <w:lang w:eastAsia="ru-RU"/>
+          <w:sz w:val="28"/>
+          <w:szCs w:val="28"/>
+          <w:lang w:val="uk-UA" w:eastAsia="ru-RU"/>
         </w:rPr>
         <w:t xml:space="preserve">100% </w:t>
       </w:r>
       <w:r>
         <w:rPr>
           <w:rFonts w:ascii="Times New Roman" w:eastAsia="Times New Roman" w:hAnsi="Times New Roman" w:cs="Times New Roman"/>
-          <w:sz w:val="24"/>
-          <w:szCs w:val="24"/>
-          <w:lang w:eastAsia="ru-RU"/>
+          <w:sz w:val="28"/>
+          <w:szCs w:val="28"/>
+          <w:lang w:val="uk-UA" w:eastAsia="ru-RU"/>
         </w:rPr>
         <w:t xml:space="preserve">"вбитих мутантів", що свідчить про ефективність тестового покриття. </w:t>
       </w:r>
@@ -881,18 +1303,21 @@
         <w:jc w:val="both"/>
         <w:rPr>
           <w:rFonts w:ascii="Times New Roman" w:eastAsia="Times New Roman" w:hAnsi="Times New Roman" w:cs="Times New Roman"/>
-          <w:sz w:val="24"/>
-          <w:szCs w:val="24"/>
-          <w:lang w:eastAsia="ru-RU"/>
-        </w:rPr>
-      </w:pPr>
-      <w:r>
-        <w:rPr>
+          <w:sz w:val="28"/>
+          <w:szCs w:val="28"/>
+          <w:lang w:val="uk-UA" w:eastAsia="ru-RU"/>
+        </w:rPr>
+      </w:pPr>
+      <w:r>
+        <w:rPr>
+          <w:rFonts w:ascii="Times New Roman" w:hAnsi="Times New Roman" w:cs="Times New Roman"/>
           <w:noProof/>
-          <w:lang w:eastAsia="ru-RU"/>
+          <w:sz w:val="28"/>
+          <w:szCs w:val="28"/>
+          <w:lang w:val="uk-UA" w:eastAsia="ru-RU"/>
         </w:rPr>
         <w:drawing>
-          <wp:inline distT="0" distB="0" distL="0" distR="0" wp14:anchorId="237318D7" wp14:editId="4A07BAE0">
+          <wp:inline distT="0" distB="0" distL="0" distR="0" wp14:anchorId="49B249A0" wp14:editId="57BF5C1C">
             <wp:extent cx="5940425" cy="969645"/>
             <wp:effectExtent l="0" t="0" r="3175" b="1905"/>
             <wp:docPr id="1" name="Рисунок 1"/>
@@ -930,15 +1355,38 @@
     </w:p>
     <w:p>
       <w:pPr>
+        <w:rPr>
+          <w:rFonts w:ascii="Times New Roman" w:eastAsia="Times New Roman" w:hAnsi="Times New Roman" w:cs="Times New Roman"/>
+          <w:b/>
+          <w:bCs/>
+          <w:sz w:val="28"/>
+          <w:szCs w:val="28"/>
+          <w:lang w:val="uk-UA" w:eastAsia="ru-RU"/>
+        </w:rPr>
+      </w:pPr>
+      <w:r>
+        <w:rPr>
+          <w:rFonts w:ascii="Times New Roman" w:eastAsia="Times New Roman" w:hAnsi="Times New Roman" w:cs="Times New Roman"/>
+          <w:b/>
+          <w:bCs/>
+          <w:sz w:val="28"/>
+          <w:szCs w:val="28"/>
+          <w:lang w:val="uk-UA" w:eastAsia="ru-RU"/>
+        </w:rPr>
+        <w:br w:type="page"/>
+      </w:r>
+    </w:p>
+    <w:p>
+      <w:pPr>
         <w:spacing w:before="100" w:beforeAutospacing="1" w:after="100" w:afterAutospacing="1" w:line="360" w:lineRule="auto"/>
         <w:jc w:val="center"/>
         <w:rPr>
           <w:rFonts w:ascii="Times New Roman" w:eastAsia="Times New Roman" w:hAnsi="Times New Roman" w:cs="Times New Roman"/>
           <w:b/>
           <w:bCs/>
-          <w:sz w:val="36"/>
-          <w:szCs w:val="36"/>
-          <w:lang w:eastAsia="ru-RU"/>
+          <w:sz w:val="28"/>
+          <w:szCs w:val="28"/>
+          <w:lang w:val="uk-UA" w:eastAsia="ru-RU"/>
         </w:rPr>
       </w:pPr>
       <w:r>
@@ -946,10 +1394,11 @@
           <w:rFonts w:ascii="Times New Roman" w:eastAsia="Times New Roman" w:hAnsi="Times New Roman" w:cs="Times New Roman"/>
           <w:b/>
           <w:bCs/>
-          <w:sz w:val="36"/>
-          <w:szCs w:val="36"/>
-          <w:lang w:eastAsia="ru-RU"/>
-        </w:rPr>
+          <w:sz w:val="28"/>
+          <w:szCs w:val="28"/>
+          <w:lang w:val="uk-UA" w:eastAsia="ru-RU"/>
+        </w:rPr>
+        <w:lastRenderedPageBreak/>
         <w:t>5. Загальна оцінка покриття</w:t>
       </w:r>
     </w:p>
@@ -959,23 +1408,48 @@
           <w:ilvl w:val="0"/>
           <w:numId w:val="15"/>
         </w:numPr>
+        <w:tabs>
+          <w:tab w:val="clear" w:pos="720"/>
+          <w:tab w:val="num" w:pos="360"/>
+        </w:tabs>
         <w:spacing w:before="100" w:beforeAutospacing="1" w:after="100" w:afterAutospacing="1" w:line="360" w:lineRule="auto"/>
+        <w:ind w:left="0" w:firstLine="709"/>
         <w:jc w:val="both"/>
         <w:rPr>
           <w:rFonts w:ascii="Times New Roman" w:eastAsia="Times New Roman" w:hAnsi="Times New Roman" w:cs="Times New Roman"/>
-          <w:sz w:val="24"/>
-          <w:szCs w:val="24"/>
-          <w:lang w:eastAsia="ru-RU"/>
-        </w:rPr>
-      </w:pPr>
-      <w:r>
-        <w:rPr>
-          <w:rFonts w:ascii="Times New Roman" w:eastAsia="Times New Roman" w:hAnsi="Times New Roman" w:cs="Times New Roman"/>
-          <w:sz w:val="24"/>
-          <w:szCs w:val="24"/>
-          <w:lang w:eastAsia="ru-RU"/>
-        </w:rPr>
-        <w:t>Модуль Product повністю охоплений модульними тестами.</w:t>
+          <w:sz w:val="28"/>
+          <w:szCs w:val="28"/>
+          <w:lang w:val="uk-UA" w:eastAsia="ru-RU"/>
+        </w:rPr>
+      </w:pPr>
+      <w:r>
+        <w:rPr>
+          <w:rFonts w:ascii="Times New Roman" w:eastAsia="Times New Roman" w:hAnsi="Times New Roman" w:cs="Times New Roman"/>
+          <w:sz w:val="28"/>
+          <w:szCs w:val="28"/>
+          <w:lang w:val="uk-UA" w:eastAsia="ru-RU"/>
+        </w:rPr>
+        <w:t xml:space="preserve">Модуль </w:t>
+      </w:r>
+      <w:proofErr w:type="spellStart"/>
+      <w:r>
+        <w:rPr>
+          <w:rFonts w:ascii="Times New Roman" w:eastAsia="Times New Roman" w:hAnsi="Times New Roman" w:cs="Times New Roman"/>
+          <w:sz w:val="28"/>
+          <w:szCs w:val="28"/>
+          <w:lang w:val="uk-UA" w:eastAsia="ru-RU"/>
+        </w:rPr>
+        <w:t>Product</w:t>
+      </w:r>
+      <w:proofErr w:type="spellEnd"/>
+      <w:r>
+        <w:rPr>
+          <w:rFonts w:ascii="Times New Roman" w:eastAsia="Times New Roman" w:hAnsi="Times New Roman" w:cs="Times New Roman"/>
+          <w:sz w:val="28"/>
+          <w:szCs w:val="28"/>
+          <w:lang w:val="uk-UA" w:eastAsia="ru-RU"/>
+        </w:rPr>
+        <w:t xml:space="preserve"> повністю охоплений модульними тестами.</w:t>
       </w:r>
     </w:p>
     <w:p>
@@ -984,21 +1458,26 @@
           <w:ilvl w:val="0"/>
           <w:numId w:val="15"/>
         </w:numPr>
+        <w:tabs>
+          <w:tab w:val="clear" w:pos="720"/>
+          <w:tab w:val="num" w:pos="360"/>
+        </w:tabs>
         <w:spacing w:before="100" w:beforeAutospacing="1" w:after="100" w:afterAutospacing="1" w:line="360" w:lineRule="auto"/>
+        <w:ind w:left="0" w:firstLine="709"/>
         <w:jc w:val="both"/>
         <w:rPr>
           <w:rFonts w:ascii="Times New Roman" w:eastAsia="Times New Roman" w:hAnsi="Times New Roman" w:cs="Times New Roman"/>
-          <w:sz w:val="24"/>
-          <w:szCs w:val="24"/>
-          <w:lang w:eastAsia="ru-RU"/>
-        </w:rPr>
-      </w:pPr>
-      <w:r>
-        <w:rPr>
-          <w:rFonts w:ascii="Times New Roman" w:eastAsia="Times New Roman" w:hAnsi="Times New Roman" w:cs="Times New Roman"/>
-          <w:sz w:val="24"/>
-          <w:szCs w:val="24"/>
-          <w:lang w:eastAsia="ru-RU"/>
+          <w:sz w:val="28"/>
+          <w:szCs w:val="28"/>
+          <w:lang w:val="uk-UA" w:eastAsia="ru-RU"/>
+        </w:rPr>
+      </w:pPr>
+      <w:r>
+        <w:rPr>
+          <w:rFonts w:ascii="Times New Roman" w:eastAsia="Times New Roman" w:hAnsi="Times New Roman" w:cs="Times New Roman"/>
+          <w:sz w:val="28"/>
+          <w:szCs w:val="28"/>
+          <w:lang w:val="uk-UA" w:eastAsia="ru-RU"/>
         </w:rPr>
         <w:t>Інтеграційне середовище налаштовано таким чином, щоб виключити вплив ручних налаштувань.</w:t>
       </w:r>
@@ -1009,21 +1488,26 @@
           <w:ilvl w:val="0"/>
           <w:numId w:val="15"/>
         </w:numPr>
+        <w:tabs>
+          <w:tab w:val="clear" w:pos="720"/>
+          <w:tab w:val="num" w:pos="360"/>
+        </w:tabs>
         <w:spacing w:before="100" w:beforeAutospacing="1" w:after="100" w:afterAutospacing="1" w:line="360" w:lineRule="auto"/>
+        <w:ind w:left="0" w:firstLine="709"/>
         <w:jc w:val="both"/>
         <w:rPr>
           <w:rFonts w:ascii="Times New Roman" w:eastAsia="Times New Roman" w:hAnsi="Times New Roman" w:cs="Times New Roman"/>
-          <w:sz w:val="24"/>
-          <w:szCs w:val="24"/>
-          <w:lang w:eastAsia="ru-RU"/>
-        </w:rPr>
-      </w:pPr>
-      <w:r>
-        <w:rPr>
-          <w:rFonts w:ascii="Times New Roman" w:eastAsia="Times New Roman" w:hAnsi="Times New Roman" w:cs="Times New Roman"/>
-          <w:sz w:val="24"/>
-          <w:szCs w:val="24"/>
-          <w:lang w:eastAsia="ru-RU"/>
+          <w:sz w:val="28"/>
+          <w:szCs w:val="28"/>
+          <w:lang w:val="uk-UA" w:eastAsia="ru-RU"/>
+        </w:rPr>
+      </w:pPr>
+      <w:r>
+        <w:rPr>
+          <w:rFonts w:ascii="Times New Roman" w:eastAsia="Times New Roman" w:hAnsi="Times New Roman" w:cs="Times New Roman"/>
+          <w:sz w:val="28"/>
+          <w:szCs w:val="28"/>
+          <w:lang w:val="uk-UA" w:eastAsia="ru-RU"/>
         </w:rPr>
         <w:t>E2E сценарій підтверджує коректну взаємодію всіх компонентів системи.</w:t>
       </w:r>
@@ -1034,42 +1518,38 @@
           <w:ilvl w:val="0"/>
           <w:numId w:val="15"/>
         </w:numPr>
+        <w:tabs>
+          <w:tab w:val="clear" w:pos="720"/>
+          <w:tab w:val="num" w:pos="360"/>
+        </w:tabs>
         <w:spacing w:before="100" w:beforeAutospacing="1" w:after="100" w:afterAutospacing="1" w:line="360" w:lineRule="auto"/>
+        <w:ind w:left="0" w:firstLine="709"/>
         <w:jc w:val="both"/>
         <w:rPr>
           <w:rFonts w:ascii="Times New Roman" w:eastAsia="Times New Roman" w:hAnsi="Times New Roman" w:cs="Times New Roman"/>
-          <w:sz w:val="24"/>
-          <w:szCs w:val="24"/>
-          <w:lang w:eastAsia="ru-RU"/>
-        </w:rPr>
-      </w:pPr>
-      <w:r>
-        <w:rPr>
-          <w:rFonts w:ascii="Times New Roman" w:eastAsia="Times New Roman" w:hAnsi="Times New Roman" w:cs="Times New Roman"/>
-          <w:sz w:val="24"/>
-          <w:szCs w:val="24"/>
-          <w:lang w:eastAsia="ru-RU"/>
-        </w:rPr>
-        <w:lastRenderedPageBreak/>
-        <w:t>Мутаційне тестування продемонструвало реальну спроможні</w:t>
-      </w:r>
-      <w:bookmarkStart w:id="0" w:name="_GoBack"/>
-      <w:bookmarkEnd w:id="0"/>
-      <w:r>
-        <w:rPr>
-          <w:rFonts w:ascii="Times New Roman" w:eastAsia="Times New Roman" w:hAnsi="Times New Roman" w:cs="Times New Roman"/>
-          <w:sz w:val="24"/>
-          <w:szCs w:val="24"/>
-          <w:lang w:eastAsia="ru-RU"/>
-        </w:rPr>
-        <w:t>сть тестів виявляти помилки та перевіряти бізнес-логіку, а не лише проходити позитивні гілки виконання.</w:t>
+          <w:sz w:val="28"/>
+          <w:szCs w:val="28"/>
+          <w:lang w:val="uk-UA" w:eastAsia="ru-RU"/>
+        </w:rPr>
+      </w:pPr>
+      <w:r>
+        <w:rPr>
+          <w:rFonts w:ascii="Times New Roman" w:eastAsia="Times New Roman" w:hAnsi="Times New Roman" w:cs="Times New Roman"/>
+          <w:sz w:val="28"/>
+          <w:szCs w:val="28"/>
+          <w:lang w:val="uk-UA" w:eastAsia="ru-RU"/>
+        </w:rPr>
+        <w:t>Мутаційне тестування продемонструвало реальну спроможність тестів виявляти помилки та перевіряти бізнес-логіку, а не лише проходити позитивні гілки виконання.</w:t>
       </w:r>
     </w:p>
     <w:p>
       <w:pPr>
         <w:spacing w:line="360" w:lineRule="auto"/>
         <w:rPr>
-          <w:lang w:val="en-US"/>
+          <w:rFonts w:ascii="Times New Roman" w:hAnsi="Times New Roman" w:cs="Times New Roman"/>
+          <w:sz w:val="28"/>
+          <w:szCs w:val="28"/>
+          <w:lang w:val="uk-UA"/>
         </w:rPr>
       </w:pPr>
     </w:p>
@@ -1084,7 +1564,7 @@
 </file>
 
 <file path=word/numbering.xml><?xml version="1.0" encoding="utf-8"?>
-<w:numbering xmlns:wpc="http://schemas.microsoft.com/office/word/2010/wordprocessingCanvas" xmlns:mc="http://schemas.openxmlformats.org/markup-compatibility/2006" xmlns:o="urn:schemas-microsoft-com:office:office" xmlns:r="http://schemas.openxmlformats.org/officeDocument/2006/relationships" xmlns:m="http://schemas.openxmlformats.org/officeDocument/2006/math" xmlns:v="urn:schemas-microsoft-com:vml" xmlns:wp14="http://schemas.microsoft.com/office/word/2010/wordprocessingDrawing" xmlns:wp="http://schemas.openxmlformats.org/drawingml/2006/wordprocessingDrawing" xmlns:w10="urn:schemas-microsoft-com:office:word" xmlns:w="http://schemas.openxmlformats.org/wordprocessingml/2006/main" xmlns:w14="http://schemas.microsoft.com/office/word/2010/wordml" xmlns:w15="http://schemas.microsoft.com/office/word/2012/wordml" xmlns:wpg="http://schemas.microsoft.com/office/word/2010/wordprocessingGroup" xmlns:wpi="http://schemas.microsoft.com/office/word/2010/wordprocessingInk" xmlns:wne="http://schemas.microsoft.com/office/word/2006/wordml" xmlns:wps="http://schemas.microsoft.com/office/word/2010/wordprocessingShape" mc:Ignorable="w14 w15 wp14">
+<w:numbering xmlns:wpc="http://schemas.microsoft.com/office/word/2010/wordprocessingCanvas" xmlns:cx="http://schemas.microsoft.com/office/drawing/2014/chartex" xmlns:cx1="http://schemas.microsoft.com/office/drawing/2015/9/8/chartex" xmlns:cx2="http://schemas.microsoft.com/office/drawing/2015/10/21/chartex" xmlns:cx3="http://schemas.microsoft.com/office/drawing/2016/5/9/chartex" xmlns:cx4="http://schemas.microsoft.com/office/drawing/2016/5/10/chartex" xmlns:cx5="http://schemas.microsoft.com/office/drawing/2016/5/11/chartex" xmlns:cx6="http://schemas.microsoft.com/office/drawing/2016/5/12/chartex" xmlns:cx7="http://schemas.microsoft.com/office/drawing/2016/5/13/chartex" xmlns:cx8="http://schemas.microsoft.com/office/drawing/2016/5/14/chartex" xmlns:mc="http://schemas.openxmlformats.org/markup-compatibility/2006" xmlns:aink="http://schemas.microsoft.com/office/drawing/2016/ink" xmlns:am3d="http://schemas.microsoft.com/office/drawing/2017/model3d" xmlns:o="urn:schemas-microsoft-com:office:office" xmlns:oel="http://schemas.microsoft.com/office/2019/extlst" xmlns:r="http://schemas.openxmlformats.org/officeDocument/2006/relationships" xmlns:m="http://schemas.openxmlformats.org/officeDocument/2006/math" xmlns:v="urn:schemas-microsoft-com:vml" xmlns:wp14="http://schemas.microsoft.com/office/word/2010/wordprocessingDrawing" xmlns:wp="http://schemas.openxmlformats.org/drawingml/2006/wordprocessingDrawing" xmlns:w10="urn:schemas-microsoft-com:office:word" xmlns:w="http://schemas.openxmlformats.org/wordprocessingml/2006/main" xmlns:w14="http://schemas.microsoft.com/office/word/2010/wordml" xmlns:w15="http://schemas.microsoft.com/office/word/2012/wordml" xmlns:w16cex="http://schemas.microsoft.com/office/word/2018/wordml/cex" xmlns:w16cid="http://schemas.microsoft.com/office/word/2016/wordml/cid" xmlns:w16="http://schemas.microsoft.com/office/word/2018/wordml" xmlns:w16du="http://schemas.microsoft.com/office/word/2023/wordml/word16du" xmlns:w16sdtdh="http://schemas.microsoft.com/office/word/2020/wordml/sdtdatahash" xmlns:w16sdtfl="http://schemas.microsoft.com/office/word/2024/wordml/sdtformatlock" xmlns:w16se="http://schemas.microsoft.com/office/word/2015/wordml/symex" xmlns:wpg="http://schemas.microsoft.com/office/word/2010/wordprocessingGroup" xmlns:wpi="http://schemas.microsoft.com/office/word/2010/wordprocessingInk" xmlns:wne="http://schemas.microsoft.com/office/word/2006/wordml" xmlns:wps="http://schemas.microsoft.com/office/word/2010/wordprocessingShape" mc:Ignorable="w14 w15 w16se w16cid w16 w16cex w16sdtdh w16sdtfl w16du wp14">
   <w:abstractNum w:abstractNumId="0" w15:restartNumberingAfterBreak="0">
     <w:nsid w:val="114657C6"/>
     <w:multiLevelType w:val="multilevel"/>
@@ -3212,56 +3692,56 @@
       </w:rPr>
     </w:lvl>
   </w:abstractNum>
-  <w:num w:numId="1">
+  <w:num w:numId="1" w16cid:durableId="686255778">
     <w:abstractNumId w:val="10"/>
   </w:num>
-  <w:num w:numId="2">
+  <w:num w:numId="2" w16cid:durableId="1854373609">
     <w:abstractNumId w:val="1"/>
   </w:num>
-  <w:num w:numId="3">
+  <w:num w:numId="3" w16cid:durableId="808208469">
     <w:abstractNumId w:val="6"/>
   </w:num>
-  <w:num w:numId="4">
+  <w:num w:numId="4" w16cid:durableId="1698853219">
     <w:abstractNumId w:val="12"/>
   </w:num>
-  <w:num w:numId="5">
+  <w:num w:numId="5" w16cid:durableId="926577722">
     <w:abstractNumId w:val="14"/>
   </w:num>
-  <w:num w:numId="6">
+  <w:num w:numId="6" w16cid:durableId="2118014070">
     <w:abstractNumId w:val="11"/>
   </w:num>
-  <w:num w:numId="7">
+  <w:num w:numId="7" w16cid:durableId="13532930">
     <w:abstractNumId w:val="8"/>
   </w:num>
-  <w:num w:numId="8">
+  <w:num w:numId="8" w16cid:durableId="1352337908">
     <w:abstractNumId w:val="3"/>
   </w:num>
-  <w:num w:numId="9">
+  <w:num w:numId="9" w16cid:durableId="741104641">
     <w:abstractNumId w:val="13"/>
   </w:num>
-  <w:num w:numId="10">
+  <w:num w:numId="10" w16cid:durableId="689794362">
     <w:abstractNumId w:val="0"/>
   </w:num>
-  <w:num w:numId="11">
+  <w:num w:numId="11" w16cid:durableId="1793941150">
     <w:abstractNumId w:val="9"/>
   </w:num>
-  <w:num w:numId="12">
+  <w:num w:numId="12" w16cid:durableId="750588884">
     <w:abstractNumId w:val="5"/>
   </w:num>
-  <w:num w:numId="13">
+  <w:num w:numId="13" w16cid:durableId="279383062">
     <w:abstractNumId w:val="7"/>
   </w:num>
-  <w:num w:numId="14">
+  <w:num w:numId="14" w16cid:durableId="992878455">
     <w:abstractNumId w:val="4"/>
   </w:num>
-  <w:num w:numId="15">
+  <w:num w:numId="15" w16cid:durableId="581528279">
     <w:abstractNumId w:val="2"/>
   </w:num>
 </w:numbering>
 </file>
 
 <file path=word/styles.xml><?xml version="1.0" encoding="utf-8"?>
-<w:styles xmlns:mc="http://schemas.openxmlformats.org/markup-compatibility/2006" xmlns:r="http://schemas.openxmlformats.org/officeDocument/2006/relationships" xmlns:w="http://schemas.openxmlformats.org/wordprocessingml/2006/main" xmlns:w14="http://schemas.microsoft.com/office/word/2010/wordml" xmlns:w15="http://schemas.microsoft.com/office/word/2012/wordml" mc:Ignorable="w14 w15">
+<w:styles xmlns:mc="http://schemas.openxmlformats.org/markup-compatibility/2006" xmlns:r="http://schemas.openxmlformats.org/officeDocument/2006/relationships" xmlns:w="http://schemas.openxmlformats.org/wordprocessingml/2006/main" xmlns:w14="http://schemas.microsoft.com/office/word/2010/wordml" xmlns:w15="http://schemas.microsoft.com/office/word/2012/wordml" xmlns:w16cex="http://schemas.microsoft.com/office/word/2018/wordml/cex" xmlns:w16cid="http://schemas.microsoft.com/office/word/2016/wordml/cid" xmlns:w16="http://schemas.microsoft.com/office/word/2018/wordml" xmlns:w16du="http://schemas.microsoft.com/office/word/2023/wordml/word16du" xmlns:w16sdtdh="http://schemas.microsoft.com/office/word/2020/wordml/sdtdatahash" xmlns:w16sdtfl="http://schemas.microsoft.com/office/word/2024/wordml/sdtformatlock" xmlns:w16se="http://schemas.microsoft.com/office/word/2015/wordml/symex" mc:Ignorable="w14 w15 w16se w16cid w16 w16cex w16sdtdh w16sdtfl w16du">
   <w:docDefaults>
     <w:rPrDefault>
       <w:rPr>
@@ -3277,7 +3757,7 @@
       </w:pPr>
     </w:pPrDefault>
   </w:docDefaults>
-  <w:latentStyles w:defLockedState="0" w:defUIPriority="99" w:defSemiHidden="0" w:defUnhideWhenUsed="0" w:defQFormat="0" w:count="371">
+  <w:latentStyles w:defLockedState="0" w:defUIPriority="99" w:defSemiHidden="0" w:defUnhideWhenUsed="0" w:defQFormat="0" w:count="376">
     <w:lsdException w:name="Normal" w:uiPriority="0" w:qFormat="1"/>
     <w:lsdException w:name="heading 1" w:uiPriority="9" w:qFormat="1"/>
     <w:lsdException w:name="heading 2" w:semiHidden="1" w:uiPriority="9" w:unhideWhenUsed="1" w:qFormat="1"/>
@@ -3649,15 +4129,20 @@
     <w:lsdException w:name="List Table 5 Dark Accent 6" w:uiPriority="50"/>
     <w:lsdException w:name="List Table 6 Colorful Accent 6" w:uiPriority="51"/>
     <w:lsdException w:name="List Table 7 Colorful Accent 6" w:uiPriority="52"/>
+    <w:lsdException w:name="Mention" w:semiHidden="1" w:unhideWhenUsed="1"/>
+    <w:lsdException w:name="Smart Hyperlink" w:semiHidden="1" w:unhideWhenUsed="1"/>
+    <w:lsdException w:name="Hashtag" w:semiHidden="1" w:unhideWhenUsed="1"/>
+    <w:lsdException w:name="Unresolved Mention" w:semiHidden="1" w:unhideWhenUsed="1"/>
+    <w:lsdException w:name="Smart Link" w:semiHidden="1" w:unhideWhenUsed="1"/>
   </w:latentStyles>
-  <w:style w:type="paragraph" w:default="1" w:styleId="a">
+  <w:style w:type="paragraph" w:default="1" w:styleId="Normal">
     <w:name w:val="Normal"/>
     <w:qFormat/>
   </w:style>
-  <w:style w:type="paragraph" w:styleId="1">
+  <w:style w:type="paragraph" w:styleId="Heading1">
     <w:name w:val="heading 1"/>
-    <w:basedOn w:val="a"/>
-    <w:link w:val="10"/>
+    <w:basedOn w:val="Normal"/>
+    <w:link w:val="Heading1Char"/>
     <w:uiPriority w:val="9"/>
     <w:qFormat/>
     <w:rsid w:val="00F70CAD"/>
@@ -3675,10 +4160,10 @@
       <w:lang w:eastAsia="ru-RU"/>
     </w:rPr>
   </w:style>
-  <w:style w:type="paragraph" w:styleId="2">
+  <w:style w:type="paragraph" w:styleId="Heading2">
     <w:name w:val="heading 2"/>
-    <w:basedOn w:val="a"/>
-    <w:link w:val="20"/>
+    <w:basedOn w:val="Normal"/>
+    <w:link w:val="Heading2Char"/>
     <w:uiPriority w:val="9"/>
     <w:qFormat/>
     <w:rsid w:val="00F70CAD"/>
@@ -3695,13 +4180,13 @@
       <w:lang w:eastAsia="ru-RU"/>
     </w:rPr>
   </w:style>
-  <w:style w:type="character" w:default="1" w:styleId="a0">
+  <w:style w:type="character" w:default="1" w:styleId="DefaultParagraphFont">
     <w:name w:val="Default Paragraph Font"/>
     <w:uiPriority w:val="1"/>
     <w:semiHidden/>
     <w:unhideWhenUsed/>
   </w:style>
-  <w:style w:type="table" w:default="1" w:styleId="a1">
+  <w:style w:type="table" w:default="1" w:styleId="TableNormal">
     <w:name w:val="Normal Table"/>
     <w:uiPriority w:val="99"/>
     <w:semiHidden/>
@@ -3716,16 +4201,16 @@
       </w:tblCellMar>
     </w:tblPr>
   </w:style>
-  <w:style w:type="numbering" w:default="1" w:styleId="a2">
+  <w:style w:type="numbering" w:default="1" w:styleId="NoList">
     <w:name w:val="No List"/>
     <w:uiPriority w:val="99"/>
     <w:semiHidden/>
     <w:unhideWhenUsed/>
   </w:style>
-  <w:style w:type="character" w:customStyle="1" w:styleId="10">
-    <w:name w:val="Заголовок 1 Знак"/>
-    <w:basedOn w:val="a0"/>
-    <w:link w:val="1"/>
+  <w:style w:type="character" w:customStyle="1" w:styleId="Heading1Char">
+    <w:name w:val="Heading 1 Char"/>
+    <w:basedOn w:val="DefaultParagraphFont"/>
+    <w:link w:val="Heading1"/>
     <w:uiPriority w:val="9"/>
     <w:rsid w:val="00F70CAD"/>
     <w:rPr>
@@ -3738,10 +4223,10 @@
       <w:lang w:eastAsia="ru-RU"/>
     </w:rPr>
   </w:style>
-  <w:style w:type="character" w:customStyle="1" w:styleId="20">
-    <w:name w:val="Заголовок 2 Знак"/>
-    <w:basedOn w:val="a0"/>
-    <w:link w:val="2"/>
+  <w:style w:type="character" w:customStyle="1" w:styleId="Heading2Char">
+    <w:name w:val="Heading 2 Char"/>
+    <w:basedOn w:val="DefaultParagraphFont"/>
+    <w:link w:val="Heading2"/>
     <w:uiPriority w:val="9"/>
     <w:rsid w:val="00F70CAD"/>
     <w:rPr>
@@ -3753,9 +4238,9 @@
       <w:lang w:eastAsia="ru-RU"/>
     </w:rPr>
   </w:style>
-  <w:style w:type="character" w:styleId="a3">
+  <w:style w:type="character" w:styleId="Strong">
     <w:name w:val="Strong"/>
-    <w:basedOn w:val="a0"/>
+    <w:basedOn w:val="DefaultParagraphFont"/>
     <w:uiPriority w:val="22"/>
     <w:qFormat/>
     <w:rsid w:val="00F70CAD"/>
@@ -3764,9 +4249,9 @@
       <w:bCs/>
     </w:rPr>
   </w:style>
-  <w:style w:type="paragraph" w:styleId="a4">
+  <w:style w:type="paragraph" w:styleId="NormalWeb">
     <w:name w:val="Normal (Web)"/>
-    <w:basedOn w:val="a"/>
+    <w:basedOn w:val="Normal"/>
     <w:uiPriority w:val="99"/>
     <w:semiHidden/>
     <w:unhideWhenUsed/>

</xml_diff>